<commit_message>
docs: align abstract, discussion and conclusion with the low-rank NMF residual
논문의 2.4절과 3.10-3.11절은 저랭크 잔차 경로를 서술하고 검증하는데,
초록·고찰·결론은 여전히 'NMF를 디코더가 아니라 토큰으로 쓴다'고 주장해
서로 모순이었다. 세 곳을 새 설계에 맞추고, 함께 정리한다.

- 초록에 저랭크 잔차, 감마 녹아웃, KIRC를 반영
- 서론 설계 항목을 넷에서 다섯으로 늘려 잔차 경로를 추가
- 2.1절에서 랭크 상한 폐기와 잔차 절충을 구분해 서술
- 2.7절에 KIRC 준비와 코호트별 경로 매핑 차이를 추가
- 3.10절에 정확도 파생 지표 넷이 z-RMSE 순위를 그대로 재현하고
  경로 진폭만 그 순위를 깬다는 논지를 추가
- 고찰에 생물학 지표 경고를 넣고 한계에 진폭 우위의 코호트 제약과
  후속 분석 미검증을 추가
- models_nmf_tf.py 독스트링과 md_to_docx.py 절대경로를 수정

Co-authored-by: Doyeon <llovable@users.noreply.github.com>
</commit_message>
<xml_diff>
--- a/mochi_code/paper/manuscript_draft_260818.docx
+++ b/mochi_code/paper/manuscript_draft_260818.docx
@@ -85,7 +85,7 @@
     </w:p>
     <w:p>
       <w:r>
-        <w:t>TCGA BRCA 원발 종양 631명과 LUAD 원발 종양 319명을 같은 규칙으로 나누어 평가하였다. 보고 모형 MOCHI는 오믹스별 선형 오토인코더의 은닉 표현을 주 경로로 두고, 학습 집합에서만 맞춘 고정 NMF 계수를 Transformer의 보조 토큰으로 넣으며, 조건부 Wasserstein GAN을 약하게 곁들인다. 칸 결측(MCAR·MNAR 30%)에서 BRCA 검사 집합 평균 z-RMSE는 각각 0.676, 0.689로, 순수 번역기(Ridge, OmicsNMF, OmiTrans, MOCHI-v5)를 뚜렷이 앞섰고 공유 잠재공간 오토인코더(MIMIR)에는 미치지 못했다. 블록 결측에서는 MIMIR(0.715)과 Ridge 2→1(0.818)이 재구성에서 앞섰고, MOCHI는 0.858이었다. LUAD 검사 집합에서도 칸 MCAR 30%는 MIMIR 0.651, MOCHI 0.697, Ridge 2→1 0.851이고, 블록 평균은 각각 0.719, 0.878, 0.836으로 순위가 같다. 번역기 비교에서는 RNA 복원에 두 번째 오믹스를 쓰는 2→1이 1→1보다 나았으나, 단백질은 RNA만 쓰는 편이 유리하였다. 구성 요소를 끈 실험에서 칸 결측의 이득은 거의 자기 은닉 가중에 있었고, 표준 결측률의 재구성 오차만 보면 Transformer와 적대항의 기여는 없었다. 그러나 조건을 바꾸면 부호가 달라진다. Transformer는 결측률 70–90% 구간에서 이득으로 돌아섰고(MCAR 90%에서 0.914 대 0.927), 적대항과 NMF 토큰은 오차가 아니라 분포에서 값을 냈다. 적대항을 끄면 특징별 표준편차 비가 0.754에서 0.692로, NMF 토큰을 빼면 0.548까지 떨어진다. Ridge 2→1은 z-RMSE가 더 낮으면서도 표준편차 비는 0.604로 더 심하게 수축한다. 한편 선행 연구가 쓰는 하위 과제 AUROC(ER, HER2, PAM50, 병기)는 방법 간 격차가 부트스트랩 신뢰구간보다 작았고, 세 과제에서 대치값이 실제 값보다 높은 AUROC를 냈다. 재구성 오차의 1등은 MIMIR로 두는 것이 데이터와 맞다. MOCHI의 기여는 칸과 블록을 한 모형이 같이 채우고, NMF를 디코더가 아니라 토큰으로 쓰며, 모듈의 값을 오차 한 지표가 아니라 결측률·분포·하위 과제로 나누어 보고한 점이다.</w:t>
+        <w:t>TCGA BRCA 원발 종양 631명, LUAD 319명, KIRC를 같은 규칙으로 나누어 평가하였다. 보고 모형 MOCHI는 오믹스별 선형 오토인코더의 은닉 표현을 주 경로로 두고, 학습 집합에서만 맞춘 고정 NMF 계수를 Transformer의 보조 토큰으로 넣는 동시에 코호트 평균에서의 계수 편차를 저랭크 잔차로 디코더 출력에 더하며, 조건부 Wasserstein GAN을 약하게 곁들인다. 칸 결측(MCAR·MNAR 30%)에서 BRCA 검사 집합 평균 z-RMSE는 각각 0.676, 0.689로, 순수 번역기(Ridge, OmicsNMF, OmiTrans, MOCHI-v5)를 뚜렷이 앞섰고 공유 잠재공간 오토인코더(MIMIR)에는 미치지 못했다. 블록 결측에서는 MIMIR(0.715)과 Ridge 2→1(0.818)이 재구성에서 앞섰고, MOCHI는 0.858이었다. LUAD 검사 집합에서도 칸 MCAR 30%는 MIMIR 0.651, MOCHI 0.697, Ridge 2→1 0.851이고, 블록 평균은 각각 0.719, 0.878, 0.836으로 순위가 같다. 번역기 비교에서는 RNA 복원에 두 번째 오믹스를 쓰는 2→1이 1→1보다 나았으나, 단백질은 RNA만 쓰는 편이 유리하였다. 구성 요소를 끈 실험에서 칸 결측의 이득은 거의 자기 은닉 가중에 있었고, 표준 결측률의 재구성 오차만 보면 Transformer와 적대항의 기여는 없었다. 그러나 조건을 바꾸면 부호가 달라진다. Transformer는 결측률 70–90% 구간에서 이득으로 돌아섰고(MCAR 90%에서 0.914 대 0.927), 적대항과 NMF 토큰은 오차가 아니라 분포에서 값을 냈다. 적대항을 끄면 특징별 표준편차 비가 0.754에서 0.692로, NMF 토큰을 빼면 0.548까지 떨어진다. Ridge 2→1은 z-RMSE가 더 낮으면서도 표준편차 비는 0.604로 더 심하게 수축한다. 한편 선행 연구가 쓰는 하위 과제 AUROC(ER, HER2, PAM50, 병기)는 방법 간 격차가 부트스트랩 신뢰구간보다 작았고, 세 과제에서 대치값이 실제 값보다 높은 AUROC를 냈다. 생물학적 보존을 다섯 축으로 다시 재었을 때도 경로 상관, 환자 간 상관, kNN 겹침, 차등 발현 t 상관은 모두 재구성 오차의 순위를 그대로 재현하여 MIMIR이 앞섰다. 그 순위를 깨는 축은 경로 활성의 진폭 하나였고, 여기서만 MOCHI가 0.973으로 MIMIR(0.882)과 Ridge 2→1(0.756)보다 참값에 가까웠다. 재학습 없이 저랭크 잔차의 계수 \gamma를 0으로 두면 이 진폭이 세 암종 모두에서 43–44% 무너지는 반면 재구성 오차는 거의 변하지 않아, 진폭을 떠받치는 것이 NMF 성분 항임을 같은 가중치 위에서 확인하였다. 재구성 오차의 1등은 MIMIR로 두는 것이 데이터와 맞다. MOCHI의 기여는 칸과 블록을 한 모형이 같이 채우고, 오차를 거의 대가로 치르지 않으면서 경로 진폭을 지키며, 그 진폭이 어느 성분에서 나오는지 녹아웃으로 지목할 수 있게 한 점이다.</w:t>
       </w:r>
     </w:p>
     <w:p>
@@ -126,7 +126,7 @@
     </w:p>
     <w:p>
       <w:r>
-        <w:t>본 연구는 그 간극을 메우기 위해 MOCHI(Multi-Omics Convergent Hybrid Imputer)를 제안한다. 이름은 세 오믹스가 하나의 융합 표현으로 모인 뒤 각자의 디코더로 돌아가는 구조를 가리킨다. 설계의 핵심은 네 가지다. 첫째, 오믹스별 얕은 오토인코더가 자기 공간을 먼저 배운다. 둘째, 학습 분할에서만 맞추고 얼린 NMF 계수 W를 Transformer의 성분 토큰으로 넣되, 재구성의 상한은 NMF 랭크에 묶지 않는다. 셋째, 빠진 오믹스의 은닉은 남은 오믹스 은닉의 평균에 Transformer 잔차를 더한 값으로 예측한다. 넷째, 칸 결측 추론에서는 자기 은닉에 큰 가중을 두고 다른 오믹스의 단서를 약하게 섞는다. 적대 학습은 조건부 critic으로 번역 분포를 다듬는 보조항이며, 재구성 오차를 이기는 주인공으로 쓰지 않는다.</w:t>
+        <w:t>본 연구는 그 간극을 메우기 위해 MOCHI(Multi-Omics Convergent Hybrid Imputer)를 제안한다. 이름은 세 오믹스가 하나의 융합 표현으로 모인 뒤 각자의 디코더로 돌아가는 구조를 가리킨다. 설계의 핵심은 다섯 가지다. 첫째, 오믹스별 얕은 오토인코더가 자기 공간을 먼저 배운다. 둘째, 학습 분할에서만 맞추고 얼린 NMF 계수 W를 Transformer의 성분 토큰으로 넣되, 재구성의 상한은 NMF 랭크에 묶지 않는다. 셋째, 융합 좌표에서 타깃의 계수를 예측하여 코호트 평균으로부터의 편차만 저랭크 잔차로 디코더 출력에 더한다. 성분이 해석되는 것과 성분이 값을 만드는 것은 다른 문장이며, 이 경로는 후자를 성립시키고 계수 \gamma를 0으로 두는 것만으로 검증할 수 있게 한다. 넷째, 빠진 오믹스의 은닉은 남은 오믹스 은닉의 평균에 Transformer 잔차를 더한 값으로 예측한다. 다섯째, 칸 결측 추론에서는 자기 은닉에 큰 가중을 두고 다른 오믹스의 단서를 약하게 섞는다. 적대 학습은 조건부 critic으로 번역 분포를 다듬는 보조항이며, 재구성 오차를 이기는 주인공으로 쓰지 않는다.</w:t>
       </w:r>
     </w:p>
     <w:p>
@@ -136,12 +136,12 @@
     </w:p>
     <w:p>
       <w:r>
-        <w:t>한 걸음 더 나아가, 이 논문은 보정기를 z-RMSE 하나로 판정하지 않는다. 대치값은 이후 분석의 입력이므로, 조건부 평균에 가까운 것과 원래의 분산·공분산을 유지하는 것은 서로 다른 요구다. 그래서 표준 결측률의 오차 외에 결측률 70–90% 구간, 소스가 하나만 남는 이중 블록, 학습 표본을 줄인 소표본, 특징별 분포 지표, 그리고 임상 표현형 하위 과제까지 다섯 축에서 같은 모형을 재평가한다. 이 과정에서 구성 요소의 기여 부호가 축마다 달라진다는 점이 드러나며, 이는 개별 모듈의 주장이라기보다 보정기 평가 방법에 대한 결과다.</w:t>
+        <w:t>한 걸음 더 나아가, 이 논문은 보정기를 z-RMSE 하나로 판정하지 않는다. 대치값은 이후 분석의 입력이므로, 조건부 평균에 가까운 것과 원래의 분산·공분산을 유지하는 것은 서로 다른 요구다. 그래서 표준 결측률의 오차 외에 결측률 70–90% 구간, 소스가 하나만 남는 이중 블록, 학습 표본을 줄인 소표본, 특징별 분포 지표, 임상 표현형 하위 과제, 그리고 대치된 자료를 실제 분석에 넣었을 때 살아남는 생물학적 성질까지 여섯 축에서 같은 모형을 재평가한다. 이 과정에서 구성 요소의 기여 부호가 축마다 달라진다는 점이 드러나며, 이는 개별 모듈의 주장이라기보다 보정기 평가 방법에 대한 결과다.</w:t>
       </w:r>
     </w:p>
     <w:p>
       <w:r>
-        <w:t>이하 구성은 다음과 같다. 2절에서 모형과 자료, 결측 프로토콜을 서술하고, 3절에서 BRCA 검사 집합의 칸·블록 결과, 1→1 대 2→1 비교, 구성 요소 제거, LUAD 재현, 그리고 스트레스·분포·하위 과제 재평가를 보고한다. 4절에서 해석과 한계를 논한다.</w:t>
+        <w:t>이하 구성은 다음과 같다. 2절에서 모형과 자료, 결측 프로토콜을 서술하고, 3절에서 BRCA 검사 집합의 칸·블록 결과, 1→1 대 2→1 비교, 구성 요소 제거, LUAD 재현, 스트레스·분포·하위 과제 재평가, 그리고 세 암종의 생물학적 보존과 저랭크 경로 녹아웃을 보고한다. 4절에서 해석과 한계를 논한다.</w:t>
       </w:r>
     </w:p>
     <w:p>
@@ -172,7 +172,7 @@
     </w:p>
     <w:p>
       <w:r>
-        <w:t>OmicsNMF와의 차이는 분명하다. OmicsNMF 생성기는 소스 벡터를 타깃 벡터로 직접 사상하고, NMF는 생성값의 기저 재구성 오차로 들어간다. MOCHI에서 NMF는 생성기의 출력을 묶는 병이 아니라, 각 오믹스의 저랭크 계수를 Transformer가 읽을 수 있는 토큰으로 바꾸는 장치다. 출력을 W H로 만들면 재구성 오차는 NMF 랭크의 상한을 넘지 못한다. 그 경로는 예비 실험에서 검증 블록 z-RMSE가 2를 넘어 폐기하였다.</w:t>
+        <w:t>OmicsNMF와의 차이는 분명하다. OmicsNMF 생성기는 소스 벡터를 타깃 벡터로 직접 사상하고, NMF는 생성값의 기저 재구성 오차로 들어간다. MOCHI에서 NMF는 생성기의 출력을 묶는 병이 아니다. 출력을 W H로 만들면 재구성 오차가 NMF 랭크의 상한을 넘지 못하며, 그 경로는 예비 실험에서 검증 블록 z-RMSE가 2를 넘어 폐기하였다. 대신 계수를 두 갈래로 쓴다. Transformer가 읽는 성분 토큰이자, 디코더 출력에 더해지는 저랭크 잔차다(2.4절). 잔차의 가중은 학습되는 작은 스칼라이므로 랭크가 상한이 되지 않으면서도 성분이 출력에 실제로 개입한다.</w:t>
       </w:r>
     </w:p>
     <w:p>
@@ -235,7 +235,7 @@
     </w:p>
     <w:p>
       <w:r>
-        <w:t>는 닫힌 형으로 계산하고, H_m은 학습 내내 얼린다. s_m은 학습 최솟값으로 정한 이동량이다. W_m의 각 성분은 해당 오믹스의 한 토큰이 되어, 성분 임베딩과 오믹스 임베딩을 더한 뒤 Transformer 인코더에 들어간다. NMF 손실은 자기 재구성과 번역 출력 모두에 대해 \|WH - (y+s)\|_2^2 형태로 약하게(λ_(\mathrmnmf)=0.1) 더한다. 이 항은 생성값이 학습 기저의 원뿔 안에 머물도록 할 뿐, 디코더를 대체하지 않는다.</w:t>
+        <w:t>는 닫힌 형으로 계산하고, H_m은 학습 내내 얼린다. s_m은 학습 최솟값으로 정한 이동량이다. W_m의 각 성분은 해당 오믹스의 한 토큰이 되어, 성분 임베딩과 오믹스 임베딩을 더한 뒤 Transformer 인코더에 들어간다. NMF 손실은 자기 재구성과 번역 출력 모두에 대해 \|WH - (y+s)\|_2^2 형태로 약하게(λ_(\mathrmnmf)=0.1) 더한다.</w:t>
       </w:r>
     </w:p>
     <w:p>
@@ -243,7 +243,73 @@
         <w:pStyle w:val="Heading2"/>
       </w:pPr>
       <w:r>
-        <w:t>2.4. 은닉 융합과 leave-one-omics-out</w:t>
+        <w:t>2.4. 저랭크 잔차 경로</w:t>
+      </w:r>
+    </w:p>
+    <w:p>
+      <w:r>
+        <w:t>토큰과 손실항만으로는 성분이 추론 시점의 출력에 개입하지 않는다. 우리는 예비 실험에서 이를 직접 확인했다(3.10절). 그래서 성분을 디코딩 경로에 명시적으로 넣는다. 융합 좌표 z에서 타깃의 계수를 예측하는 선형 머리</w:t>
+      </w:r>
+    </w:p>
+    <w:p>
+      <w:pPr>
+        <w:jc w:val="center"/>
+      </w:pPr>
+      <w:r>
+        <w:rPr>
+          <w:i/>
+        </w:rPr>
+        <w:t>\hatW_t = \mathrmReLU(A_t z + b_t)</w:t>
+      </w:r>
+    </w:p>
+    <w:p>
+      <w:r>
+        <w:t>를 두고, 그 계수를 코호트 평균 \barW_t로부터의 편차로 되돌려 디코더 출력에 더한다.</w:t>
+      </w:r>
+    </w:p>
+    <w:p>
+      <w:pPr>
+        <w:jc w:val="center"/>
+      </w:pPr>
+      <w:r>
+        <w:rPr>
+          <w:i/>
+        </w:rPr>
+        <w:t>x̂_t = D_t(h_t) + \gamma_t (\hatW_t - \barW_t) H_t .</w:t>
+      </w:r>
+    </w:p>
+    <w:p>
+      <w:r>
+        <w:t>평균을 빼면 이동량 s_t가 소거되어 잔차가 환자별 성분 활성의 편차만 담는다. A_t를 영으로, b_t를 \barW_t로 초기화하면 학습 시작 시 잔차가 정확히 0이므로 사전학습된 디코더를 흔들지 않는다. 이 초기화를 쓰지 않고 \|\hatWH - s\| 형태를 그대로 더했을 때는 -s_t가 만드는 상수 편향 때문에 InfoNCE가 0.17에서 3.05로 튀고 검증 블록 z-RMSE가 0.894에서 0.985로 무너졌다. \gamma_t는 오믹스별 학습 가능 스칼라이며 0.3에서 출발한다.</w:t>
+      </w:r>
+    </w:p>
+    <w:p>
+      <w:r>
+        <w:t>계수 머리는 보조 손실</w:t>
+      </w:r>
+    </w:p>
+    <w:p>
+      <w:pPr>
+        <w:jc w:val="center"/>
+      </w:pPr>
+      <w:r>
+        <w:rPr>
+          <w:i/>
+        </w:rPr>
+        <w:t>L_W = \frac1|M|Σ_t l\|\hatW_t - W_t^(\mathrmref)r\|_2^2</w:t>
+      </w:r>
+    </w:p>
+    <w:p>
+      <w:r>
+        <w:t>로 감독한다. W_t^(\mathrmref)는 참값 x_t에 고정 사전을 적용한 계수다. 즉 융합 좌표는 타깃의 성분 구성을 맞혀야 하고, 그 예측이 곧 출력의 일부가 된다. 성분은 이제 해석 도구가 아니라 계산 경로다.</w:t>
+      </w:r>
+    </w:p>
+    <w:p>
+      <w:pPr>
+        <w:pStyle w:val="Heading2"/>
+      </w:pPr>
+      <w:r>
+        <w:t>2.5. 은닉 융합과 leave-one-omics-out</w:t>
       </w:r>
     </w:p>
     <w:p>
@@ -269,7 +335,7 @@
     </w:p>
     <w:p>
       <w:r>
-        <w:t>이고, 복원은 x̂_t = D_t(h_t^(\mathrmLOO))이다. T_t는 공통 z를 타깃 은닉 차원으로 보내는 선형층이다. 칸 결측에서는</w:t>
+        <w:t>이고, 복원은 2.4절의 저랭크 잔차를 포함한 x̂_t = D_t(h_t^(\mathrmLOO)) + \gamma_t(\hatW_t - \barW_t)H_t이다. T_t는 공통 z를 타깃 은닉 차원으로 보내는 선형층이다. 칸 결측에서는 은닉과 계수를 같은 비율로 섞는다.</w:t>
       </w:r>
     </w:p>
     <w:p>
@@ -280,12 +346,12 @@
         <w:rPr>
           <w:i/>
         </w:rPr>
-        <w:t>h_t^(\mathrmmix) = \frac\omega h_t + h_t^(\mathrmLOO)\omega + 1,\qquad \omega=10.</w:t>
+        <w:t>h_t^(\mathrmmix) = \frac\omega h_t + h_t^(\mathrmLOO)\omega + 1,\qquad W_t^(\mathrmmix) = \frac\omega W_t + \hatW_t\omega + 1,\qquad \omega=10.</w:t>
       </w:r>
     </w:p>
     <w:p>
       <w:r>
-        <w:t>\omega=0이면 자기 좌표를 버리고 번역만 쓰게 된다.</w:t>
+        <w:t>W_t는 부분 관측된 x_t에 고정 사전을 적용한 계수다. \omega=0이면 자기 좌표를 버리고 번역만 쓰게 된다.</w:t>
       </w:r>
     </w:p>
     <w:p>
@@ -293,7 +359,7 @@
         <w:pStyle w:val="Heading2"/>
       </w:pPr>
       <w:r>
-        <w:t>2.5. 손실</w:t>
+        <w:t>2.6. 손실</w:t>
       </w:r>
     </w:p>
     <w:p>
@@ -309,12 +375,12 @@
         <w:rPr>
           <w:i/>
         </w:rPr>
-        <w:t>L = L_(\mathrmrecon) + 1.5 L_(\mathrmLOO) + 0.2 L_(\mathrmNCE) + 0.1 L_(\mathrmNMF) + L_(\mathrmWGAN).</w:t>
+        <w:t>L = L_(\mathrmrecon) + 1.5 L_(\mathrmLOO) + 0.2 L_(\mathrmNCE) + 0.1 L_(\mathrmNMF) + 0.3 L_(W) + L_(\mathrmWGAN).</w:t>
       </w:r>
     </w:p>
     <w:p>
       <w:r>
-        <w:t>L_(\mathrmrecon)은 존재하는 오믹스의 자기 재구성이며, 가린 칸과 관측 칸을 같은 비중으로 섞는다. L_(\mathrmLOO)는 타깃을 잠시 숨긴 뒤 나머지로부터 복원하는 오차다. L_(\mathrmNCE)는 같은 환자의 오믹스 은닉을 가깝게, 다른 환자를 멀게 하는 InfoNCE다. 조건부 critic은 타깃 벡터와 나머지 오믹스의 이어붙임을 받아 실제와 번역을 구분한다. Wasserstein 항에 기울기 패널티를 쓰고, 생성기 쪽 적대항의 크기가 재구성 오차의 0.1배가 되도록 배치마다 스케일한다. 적대항이 재구성을 압도하지 않게 하려는 선택이다. 조기 종료는 검증 분할의 블록 z-RMSE 평균을 본다. 칸 결측은 자기 재구성만으로도 쉽게 내려가므로, 블록을 기준으로 고르지 않으면 번역 경로가 학습되지 않는다.</w:t>
+        <w:t>L_(\mathrmrecon)은 존재하는 오믹스의 자기 재구성이며, 가린 칸과 관측 칸을 같은 비중으로 섞는다. L_(\mathrmLOO)는 타깃을 잠시 숨긴 뒤 나머지로부터 복원하는 오차다. L_W는 2.4절의 계수 보조 손실이다. L_(\mathrmNCE)는 같은 환자의 오믹스 은닉을 가깝게, 다른 환자를 멀게 하는 InfoNCE다. 조건부 critic은 타깃 벡터와 나머지 오믹스의 이어붙임을 받아 실제와 번역을 구분한다. Wasserstein 항에 기울기 패널티를 쓰고, 생성기 쪽 적대항의 크기가 재구성 오차의 0.1배가 되도록 배치마다 스케일한다. 적대항이 재구성을 압도하지 않게 하려는 선택이다. 조기 종료는 검증 분할의 블록 z-RMSE 평균을 본다. 칸 결측은 자기 재구성만으로도 쉽게 내려가므로, 블록을 기준으로 고르지 않으면 번역 경로가 학습되지 않는다.</w:t>
       </w:r>
     </w:p>
     <w:p>
@@ -322,7 +388,7 @@
         <w:pStyle w:val="Heading2"/>
       </w:pPr>
       <w:r>
-        <w:t>2.6. 자료</w:t>
+        <w:t>2.7. 자료</w:t>
       </w:r>
     </w:p>
     <w:p>
@@ -336,11 +402,16 @@
       </w:r>
     </w:p>
     <w:p>
+      <w:r>
+        <w:t>신장투명세포암(KIRC)도 같은 규칙으로 준비하여 검사 45명을 얻었다〔TODO: 삼중 교집합 총원과 학습·검증 인원을 `processed_data/gate_kirc/sample_split.tsv`에서 확인해 채울 것〕. KIRC는 저랭크 잔차 녹아웃의 재현에만 쓰고, 칸 결측 벤치마크에는 넣지 않았다. 특징 선택이 코호트별 분산 상위 k이므로 hallmark에 매핑되는 유전자와 검정에 남는 경로 수가 암종마다 다르다(LUAD 1,960 유전자·34 경로, KIRC 1,956 유전자·32 경로). 따라서 경로 지표의 절대값은 암종 간에 직접 비교하지 않고, 같은 암종 안에서 녹아웃 전후만 비교한다.</w:t>
+      </w:r>
+    </w:p>
+    <w:p>
       <w:pPr>
         <w:pStyle w:val="Heading2"/>
       </w:pPr>
       <w:r>
-        <w:t>2.7. 결측 프로토콜과 지표</w:t>
+        <w:t>2.8. 결측 프로토콜과 지표</w:t>
       </w:r>
     </w:p>
     <w:p>
@@ -358,7 +429,7 @@
         <w:pStyle w:val="Heading2"/>
       </w:pPr>
       <w:r>
-        <w:t>2.8. 비교 방법</w:t>
+        <w:t>2.9. 비교 방법</w:t>
       </w:r>
     </w:p>
     <w:p>
@@ -376,7 +447,7 @@
         <w:pStyle w:val="Heading2"/>
       </w:pPr>
       <w:r>
-        <w:t>2.9. 생존 분석</w:t>
+        <w:t>2.10. 생존 분석</w:t>
       </w:r>
     </w:p>
     <w:p>
@@ -601,6 +672,77 @@
     </w:p>
     <w:p>
       <w:pPr>
+        <w:pStyle w:val="Heading2"/>
+      </w:pPr>
+      <w:r>
+        <w:t>3.10. 생물학적 의미 보존: 경로 진폭에서만 앞선다</w:t>
+      </w:r>
+    </w:p>
+    <w:p>
+      <w:r>
+        <w:t>AUROC 대신, 대치된 자료를 실제 분석에 넣었을 때 살아남는 성질을 직접 재었다(표 10, 그림 1A). 블록 결측으로 타깃을 통째로 가린 뒤 채우고, 환자×경로 활성 행렬(hallmark 유전자 집합의 z-점수 평균), 환자 간 상관행렬, ER 양성 대 음성의 Welch t 통계량, RNA-단백질 짝 상관, 메틸화-발현 짝 상관을 참값과 비교한다. 경로 표준편차 비는 참값 대비 경로 활성의 진폭이 얼마나 남았는지를 1을 기준으로 재고, 나머지는 참값과의 일치도다.</w:t>
+      </w:r>
+    </w:p>
+    <w:p>
+      <w:r>
+        <w:t>MOCHI가 앞서는 축은 하나다. RNA 블록의 경로 표준편차 비가 0.973으로 MIMIR(0.882)과 Ridge 2→1(0.756)보다 1에 가깝다. 경로 활성의 개체 간 진폭이 거의 그대로 남는다는 뜻이다. 그 외 축에서는 MIMIR이 넓게 앞선다. 경로 상관 평균은 0.795 대 0.663, 최악 경로의 상관은 0.510 대 0.409, 환자 간 상관 일치는 0.892 대 0.833, kNN 겹침은 0.661 대 0.584, 차등 발현 t 통계량 상관은 0.914 대 0.885다. 단백질 블록에서는 격차가 더 크다(환자 상관 0.660 대 0.314). 생물학 지표에서도 MOCHI가 전면 1등이 아니라는 사실을 그대로 적는다.</w:t>
+      </w:r>
+    </w:p>
+    <w:p>
+      <w:r>
+        <w:t>그런데 어느 축에서 지는지가 규칙적이다. 표 10에서 경로 상관, 환자 간 상관 일치, kNN 겹침, 차등 발현 t 상관 네 지표의 순위는 MIMIR, Ridge 2→1, MOCHI 순으로 완전히 같고, 이는 블록 z-RMSE의 순위(0.715, 0.818, 0.858)와 정확히 일치한다. 네 지표가 독립적인 증거가 아니라 재구성 정확도를 생물학 좌표계에서 다시 잰 것이기 때문이다. 값을 더 정확히 맞히면 그 값으로 계산한 경로 점수도, 환자 간 상관도, t 통계량도 함께 정확해진다. 생물학 지표를 여러 개 늘어놓는 관행은 사실상 z-RMSE를 여러 번 보고하는 일이 될 수 있다.</w:t>
+      </w:r>
+    </w:p>
+    <w:p>
+      <w:r>
+        <w:t>이 순위를 깨는 지표는 경로 표준편차 비 하나다. 여기서만 재구성 오차가 가장 큰 MOCHI가 1등이다. 구조적인 이유가 있다. 조건부 평균 쪽으로 수축하면 제곱 오차는 줄고 생성값의 분산도 함께 준다. 두 목표가 서로 당기므로, 진폭 보존은 오차를 잘해서 딸려오는 성질이 아니라 오차를 조금 포기해야 얻는 성질이다. Ridge 2→1이 MOCHI보다 z-RMSE가 낮으면서 진폭은 0.756까지 수축하는 것이 그 대가를 보여준다. 평균 대치는 이 축의 하한으로, 모든 환자에게 같은 값을 주므로 진폭 비가 정의상 0이다. 대치 결과를 분산 기반 분석에 넣을 계획이라면 이 축이 나머지 넷보다 중요하다.</w:t>
+      </w:r>
+    </w:p>
+    <w:p>
+      <w:r>
+        <w:t>세 오믹스 모두에서 반복되는 성질이 하나 있다. 어떤 방법도 참값의 상관 강도를 온전히 복원하지 못한다. 메틸화-발현의 참 상관은 -0.111인데 MOCHI는 -0.067, Ridge는 -0.092까지만 재현한다. 부호 일치율은 0.906으로 높지만 크기는 60–80%로 줄어든다. 대치된 자료에서 상관계수의 절대값을 그대로 해석하면 효과 크기를 체계적으로 과소평가한다.</w:t>
+      </w:r>
+    </w:p>
+    <w:p>
+      <w:r>
+        <w:t>성분 자체는 해석된다. RNA 사전 20개 성분에 초기하 검정을 걸면 19번은 상피-중간엽 전이(p=1.8×10^(-32)), 5번과 10번은 인터페론 알파 반응, 8번과 11번은 초기 에스트로겐 반응, 3번은 G2M 관문에 대응한다. 성분 9번은 면역글로불린 유전자만 모여 어떤 hallmark에도 걸리지 않는다. 유방암 코호트에서 기대되는 축들이 사전에 그대로 나타난다.</w:t>
+      </w:r>
+    </w:p>
+    <w:p>
+      <w:pPr>
+        <w:pStyle w:val="Heading2"/>
+      </w:pPr>
+      <w:r>
+        <w:t>3.11. 저랭크 경로 녹아웃: 성분이 실제로 값을 만든다</w:t>
+      </w:r>
+    </w:p>
+    <w:p>
+      <w:r>
+        <w:t>성분이 해석된다는 것과 성분이 계산에 쓰인다는 것은 다른 문장이다. 예비 설계에서 우리는 뒤쪽이 성립하지 않음을 확인했다. 토큰과 손실항만 있던 모형에서 추론 시 NMF 토큰 전체를 0으로 바꿔도 융합 좌표 z가 0.09%만 변하고, 블록 z-RMSE(0.8226)와 경로 상관(0.6978), 경로 표준편차 비(0.9823/0.9822)가 소수 넷째 자리까지 같았다. 어텐션 가중도 모든 토큰에 사실상 균일했다. 성분 토큰은 잔차 융합 구조 안에서 추론 시점에 무력했고, 제거 실험에서 관찰된 차이는 토큰 경로의 기여가 아니라 재학습에 따른 초기화·학습 궤적의 차이였다.</w:t>
+      </w:r>
+    </w:p>
+    <w:p>
+      <w:r>
+        <w:t>2.4절의 저랭크 잔차 경로는 이 문제를 겨냥한다. 이제 성분은 출력에 명시적으로 더해지므로, \gamma_t를 0으로 두는 것만으로 재학습 없이 기여도를 잘라낼 수 있다. 같은 가중치, 같은 검사 집합에서 잘라낸 결과가 표 11과 그림 1B·C이다.</w:t>
+      </w:r>
+    </w:p>
+    <w:p>
+      <w:r>
+        <w:t>효과는 크고 세 암종에서 같은 방향이다. RNA 블록의 경로 표준편차 비가 BRCA에서 0.973에서 0.556으로, LUAD에서 0.846에서 0.483으로, KIRC에서 0.796에서 0.445로 떨어진다. 세 코호트 모두 상대적으로 43–44% 감소다(그림 1B). 환자 간 상관 일치도 아홉 개 블록 전부에서 내려가고(예: LUAD 메틸화 0.707→0.629, KIRC 메틸화 0.761→0.664), 메틸화-발현 프로파일 상관도 세 암종 모두 내려간다. 재구성에서도 RNA와 메틸화 z-RMSE가 세 암종에서 일관되게 나빠진다(KIRC RNA 0.864→0.889, 메틸화 0.815→0.858). 경로 활성의 진폭과 환자 간 구조를 저랭크 성분 항이 떠받치고 있다는 뜻이다.</w:t>
+      </w:r>
+    </w:p>
+    <w:p>
+      <w:r>
+        <w:t>단백질은 반대다. 잘라내면 z-RMSE가 세 암종에서 모두 좋아진다(BRCA 0.905→0.882, KIRC 0.874→0.842; 그림 1C). 항체 487개로 이루어진 RPPA 층은 유전자 발현 축에서 뽑은 랭크-20 구조로 잘 설명되지 않아, 저랭크 항이 오차를 더한다. 다만 같은 조건에서 RNA-단백질 프로파일 상관은 0.900에서 0.882로 내려간다. 오차와 생물학적 구조가 여기서도 갈린다.</w:t>
+      </w:r>
+    </w:p>
+    <w:p>
+      <w:r>
+        <w:t>저랭크 경로의 대가는 작다. 세 코호트 블록 z-RMSE 평균은 저랭크를 넣은 0.837/0.858/0.851 대 넣지 않은 BRCA 0.839이며, BRCA에서는 오히려 넣은 쪽이 낮다. 검증 곡선에서 \gamma_t는 0.3에서 출발해 오믹스별로 0.29–0.34로 갈라진다. 모형은 이 경로를 끄지 않고 조금 더 쓰는 방향을 골랐다.</w:t>
+      </w:r>
+    </w:p>
+    <w:p>
+      <w:pPr>
         <w:pStyle w:val="Heading1"/>
       </w:pPr>
       <w:r>
@@ -609,7 +751,7 @@
     </w:p>
     <w:p>
       <w:r>
-        <w:t>OmicsNMF는 NMF와 GAN을 한 목적함수에 넣어, 타깃이 없는 표본까지 학습에 쓸 수 있음을 보였다. MOCHI는 그 문장을 세 오믹스의 상호보정으로 옮기되, NMF의 자리를 바꿨다. 생성기의 출력을 저랭크 곱으로 묶지 않고, 계수를 토큰으로 읽어 은닉 융합을 돕게 하였다. 적대 학습 역시 주항이 아니다. 조건부 critic은 번역이 학습 분포에서 너무 벗어나지 않게 붙잡는 규제다. 재구성 오차만 보면 MIMIR이 칸과 블록 모두에서 앞선다. 그 사실을 숨기면 논문이 거짓이 된다.</w:t>
+        <w:t>OmicsNMF는 NMF와 GAN을 한 목적함수에 넣어, 타깃이 없는 표본까지 학습에 쓸 수 있음을 보였다. MOCHI는 그 문장을 세 오믹스의 상호보정으로 옮기되, NMF의 자리를 바꿨다. 생성기의 출력을 저랭크 곱으로 묶지 않고, 계수를 토큰으로 읽어 은닉 융합을 돕게 하면서 동시에 평균 대비 계수 편차를 작은 가중의 잔차로 출력에 더한다. 랭크를 상한으로 만들지 않으면서 성분이 값에 개입하게 하려는 절충이다. 적대 학습 역시 주항이 아니다. 조건부 critic은 번역이 학습 분포에서 너무 벗어나지 않게 붙잡는 규제다. 재구성 오차만 보면 MIMIR이 칸과 블록 모두에서 앞선다. 그 사실을 숨기면 논문이 거짓이 된다.</w:t>
       </w:r>
     </w:p>
     <w:p>
@@ -629,17 +771,22 @@
     </w:p>
     <w:p>
       <w:r>
-        <w:t>하위 과제 결과는 이 논문에서 두 번째 경고로 남는다. 선행 연구는 대치된 자료로 표현형을 얼마나 잘 맞히는지를 보정 품질의 근거로 자주 쓴다. 같은 절차를 다섯 과제에 적용했을 때 방법 간 AUROC 격차는 신뢰구간 폭보다 작았고, 세 과제에서는 대치값이 실제 값보다 높은 AUROC를 냈다. 대치가 자료를 학습 분포 쪽으로 매끄럽게 만들어 분류를 쉽게 한 것이지, 원래 값을 더 잘 복원한 것이 아니다. 수백 명 규모에서 하위 과제 AUROC는 보정기를 가르는 지표가 되지 못한다.</w:t>
+        <w:t>생물학 지표에 대한 지적도 같은 결의 경고다. 대치 품질을 생물학 언어로 검증한다며 경로 상관, 환자 간 유사도, 차등 발현 일치를 나란히 보고하는 것이 관행이 되어 가는데, 우리 자료에서 이 네 지표의 방법 순위는 블록 z-RMSE의 순위와 완전히 같았다. 지표를 늘려도 새로운 정보가 늘지 않는다는 뜻이다. 정보를 더하는 것은 정확도와 방향이 반대인 지표뿐이며, 경로 활성의 진폭이 그런 지표다. 보정기를 생물학적으로 평가하겠다면 정확도에서 파생되는 축과 정확도와 상충하는 축을 갈라 보고해야 하고, 후자가 없으면 사실상 오차를 다시 보고한 것이다.</w:t>
       </w:r>
     </w:p>
     <w:p>
       <w:r>
-        <w:t>한계는 분명하다. 첫째, 재구성에서 MIMIR을 넘지 못했다. 공유 잠재공간과 자기 재구성 경로를 더 길게 쓰면 칸 오차는 더 줄 수 있으나, 그 방향은 MIMIR과 과제가 같아진다. 분포 지표에서도 MIMIR은 네 가지 중 셋에서 앞선다. 둘째, 검사 생존 사건 15건으로는 예후 보존을 말할 수 없다. 셋째, 특징은 학습 분산 상위 k이고, 전체 프로브·전사가 아니다. 넷째, MNAR은 낮은 값에 가중하는 한 가지 형태일 뿐이다. 플랫폼 실패나 배치 효과는 다른 결측이다. 다섯째, 보고 모형의 하이퍼파라미터는 BRCA 검증 블록으로 골랐다. 같은 설정을 LUAD 원발 종양 319명에 옮겼을 때도 칸·블록의 순위는 BRCA와 같았다. 여섯째, MOCHI의 융합은 소스가 둘 이상일 때만 값을 낸다. 두 오믹스를 동시에 가려 하나만 남기면 단일 소스 Ridge에 밀린다. 일곱째, 분포 지표는 특징 300개 표본에서 계산한 것이고, 상관 오차는 표본 수가 특징 수보다 훨씬 적은 조건에서 잰 값이다.</w:t>
+        <w:t>하위 과제 결과는 이 논문에서 세 번째 경고로 남는다. 선행 연구는 대치된 자료로 표현형을 얼마나 잘 맞히는지를 보정 품질의 근거로 자주 쓴다. 같은 절차를 다섯 과제에 적용했을 때 방법 간 AUROC 격차는 신뢰구간 폭보다 작았고, 세 과제에서는 대치값이 실제 값보다 높은 AUROC를 냈다. 대치가 자료를 학습 분포 쪽으로 매끄럽게 만들어 분류를 쉽게 한 것이지, 원래 값을 더 잘 복원한 것이 아니다. 수백 명 규모에서 하위 과제 AUROC는 보정기를 가르는 지표가 되지 못한다.</w:t>
       </w:r>
     </w:p>
     <w:p>
       <w:r>
-        <w:t>앞으로의 작업은 생성기를 키우는 쪽이 아니다. 단백질 블록처럼 선형이 이기는 층은 선형 경로를 명시적으로 남기고, 칸 결측처럼 자기 좌표가 있는 층은 자기 은닉 가중을 유지하는 편이 이 자료가 가리키는 방향이다. NMF는 해석 가능한 성분 토큰으로 두는 것이, 디코더로 쓰는 것보다 안전하다. 적대항과 성분 토큰은 오차를 낮추는 장치가 아니라 분포를 지키는 장치로 자리를 옮겨 평가해야 하며, 그렇다면 목적함수의 가중도 z-RMSE가 아니라 분포 지표로 고르는 것이 일관된다.</w:t>
+        <w:t>한계는 분명하다. 첫째, 재구성에서 MIMIR을 넘지 못했다. 공유 잠재공간과 자기 재구성 경로를 더 길게 쓰면 칸 오차는 더 줄 수 있으나, 그 방향은 MIMIR과 과제가 같아진다. 분포 지표에서도 MIMIR은 네 가지 중 셋에서 앞서고, 생물학 지표에서는 경로 진폭을 제외한 다섯 축에서 앞선다. 진폭 우위 역시 MIMIR을 함께 잰 코호트가 BRCA 하나뿐이므로, LUAD와 KIRC에서 같은 비교를 반복하기 전까지는 한 코호트의 관찰이다. 둘째, 검사 생존 사건 15건으로는 예후 보존을 말할 수 없다. 셋째, 특징은 학습 분산 상위 k이고, 전체 프로브·전사가 아니다. 넷째, MNAR은 낮은 값에 가중하는 한 가지 형태일 뿐이다. 플랫폼 실패나 배치 효과는 다른 결측이다. 다섯째, 보고 모형의 하이퍼파라미터는 BRCA 검증 블록으로 골랐다. 같은 설정을 LUAD 원발 종양 319명에 옮겼을 때도 칸·블록의 순위는 BRCA와 같았고, 녹아웃의 방향과 크기는 KIRC까지 세 암종에서 같았다. 여섯째, MOCHI의 융합은 소스가 둘 이상일 때만 값을 낸다. 두 오믹스를 동시에 가려 하나만 남기면 단일 소스 Ridge에 밀린다. 일곱째, 분포 지표는 특징 300개 표본에서 계산한 것이고, 상관 오차는 표본 수가 특징 수보다 훨씬 적은 조건에서 잰 값이다. 여덟째, 경로 진폭이 보존되면 이후 분석이 실제로 달라진다는 것까지는 보이지 못했다. 진폭 비 0.973과 0.756이 차등 발현의 검정력이나 군집의 안정성에서 어떤 차이로 나타나는지는 별도의 실험이 필요하며, 그것이 이 축의 실용적 의미를 확정할 것이다.</w:t>
+      </w:r>
+    </w:p>
+    <w:p>
+      <w:r>
+        <w:t>앞으로의 작업은 생성기를 키우는 쪽이 아니다. 단백질 블록처럼 선형이 이기는 층은 선형 경로를 명시적으로 남기고, 칸 결측처럼 자기 좌표가 있는 층은 자기 은닉 가중을 유지하는 편이 이 자료가 가리키는 방향이다. NMF는 랭크를 상한으로 만드는 디코더로 쓰면 무너지고, 토큰으로만 두면 추론에서 무력해진다. 작은 가중의 잔차로 출력에 얹는 중간 지점이 이 자료에서 두 실패를 모두 피했다. 단백질에서 잔차가 오차를 늘린 것을 보면 \gamma_t를 오믹스별로 더 과감하게 학습시키거나 층마다 랭크를 달리 잡을 여지도 있다. 적대항과 성분 항은 오차를 낮추는 장치가 아니라 분포를 지키는 장치로 자리를 옮겨 평가해야 하며, 그렇다면 목적함수의 가중도 z-RMSE가 아니라 분포 지표로 고르는 것이 일관된다.</w:t>
       </w:r>
     </w:p>
     <w:p>
@@ -652,12 +799,12 @@
     </w:p>
     <w:p>
       <w:r>
-        <w:t>MOCHI는 칸 결측과 블록 결측을 한 네트워크에서 다루는 다중오믹스 보정기다. 오믹스별 오토인코더가 자기 공간을 지키고, 고정 NMF 계수는 Transformer의 보조 토큰이 되며, 조건부 Wasserstein GAN은 번역 분포를 다듬는다. TCGA BRCA 631명, LUAD 319명, 고정 분할, 학습 전용 표준화와 특징 선택 위에서, 칸 결측 재구성은 자기 표현을 쓰는 모형이 번역기를 이겼고 그중 MIMIR이 가장 낮았다. 블록 결측 재구성 역시 두 암종에서 MIMIR이 1등이고, 번역기 중에서는 Ridge 2→1이 앞섰다. 2→1은 RNA에서 이득이 있고 단백질에서는 이득이 없다.</w:t>
+        <w:t>MOCHI는 칸 결측과 블록 결측을 한 네트워크에서 다루는 다중오믹스 보정기다. 오믹스별 오토인코더가 자기 공간을 지키고, 고정 NMF 계수는 Transformer의 보조 토큰이자 디코더 출력에 더해지는 저랭크 잔차가 되며, 조건부 Wasserstein GAN은 번역 분포를 다듬는다. TCGA BRCA 631명, LUAD 319명, KIRC, 고정 분할, 학습 전용 표준화와 특징 선택 위에서, 칸 결측 재구성은 자기 표현을 쓰는 모형이 번역기를 이겼고 그중 MIMIR이 가장 낮았다. 블록 결측 재구성 역시 두 암종에서 MIMIR이 1등이고, 번역기 중에서는 Ridge 2→1이 앞섰다. 2→1은 RNA에서 이득이 있고 단백질에서는 이득이 없다.</w:t>
       </w:r>
     </w:p>
     <w:p>
       <w:r>
-        <w:t>본문이 주장하는 것은 GAN의 재구성 우위가 아니다. 세 가지다. 첫째, 결측의 두 형태를 한 모형이 같이 받고, NMF를 디코더가 아니라 토큰으로 쓰며, 번역의 주 경로를 은닉에 둔 설계가 두 암종에서 성립한다. 둘째, 적대항과 성분 토큰의 값은 z-RMSE가 아니라 분포 보존에서 나타나며, Transformer의 값은 결측률 70% 이상의 극단 구간에서 나타난다. 한 지표 한 구간의 제거 실험으로 모듈을 판정하면 이 부호가 보이지 않는다. 셋째, 선행 연구가 흔히 쓰는 하위 과제 AUROC는 수백 명 코호트에서 보정기를 가르지 못하고, 대치값이 실제 값보다 높은 AUROC를 내는 방향 오류까지 일으킨다. 이 세 가지는 모두 같은 자료·같은 분할·같은 마스크에서 공개 가능한 형태로 재현된다.</w:t>
+        <w:t>본문이 주장하는 것은 GAN의 재구성 우위가 아니다. 네 가지다. 첫째, 결측의 두 형태를 한 모형이 같이 받고, NMF를 랭크 상한이 되는 디코더가 아니라 작은 가중의 잔차로 얹으며, 번역의 주 경로를 은닉에 둔 설계가 세 암종에서 성립한다. 둘째, 그 잔차가 경로 활성의 진폭을 떠받친다는 것을 재학습 없는 녹아웃으로 보였다. \gamma를 0으로 두면 진폭이 세 암종 모두에서 43–44% 무너지는 반면 블록 z-RMSE는 거의 그대로다. 성분이 해석된다는 진술을 성분이 값을 만든다는 진술로 바꾼 것이 이 논문의 설계상 기여다. 셋째, 적대항과 성분 항의 값은 z-RMSE가 아니라 분포 보존에서 나타나며, Transformer의 값은 결측률 70% 이상의 극단 구간에서 나타난다. 한 지표 한 구간의 제거 실험으로 모듈을 판정하면 이 부호가 보이지 않는다. 넷째, 평가 지표에 대한 경고가 둘이다. 생물학 지표 중 정확도에서 파생되는 넷은 방법 순위가 z-RMSE와 완전히 같아 새 정보를 주지 않으며, 선행 연구가 흔히 쓰는 하위 과제 AUROC는 수백 명 코호트에서 보정기를 가르지 못하고 대치값이 실제 값보다 높은 AUROC를 내는 방향 오류까지 일으킨다. 이 네 가지는 모두 같은 자료·같은 분할·같은 마스크에서 공개 가능한 형태로 재현된다.</w:t>
       </w:r>
     </w:p>
     <w:p>
@@ -7000,6 +7147,913 @@
       </w:tr>
     </w:tbl>
     <w:p>
+      <w:r>
+        <w:rPr>
+          <w:b/>
+        </w:rPr>
+        <w:t>표 10.</w:t>
+      </w:r>
+      <w:r>
+        <w:t xml:space="preserve"> 생물학적 보존. TCGA-BRCA 검사 집합, RNA 블록 결측. 경로 지표는 Hallmark 활성 점수의 환자 간 상관과 표준편차 비(1에 가까울수록 진폭 유지). 원자료 `results/current/bio_final_brca/biology.tsv`.</w:t>
+      </w:r>
+    </w:p>
+    <w:tbl>
+      <w:tblPr>
+        <w:tblStyle w:val="LightGrid-Accent1"/>
+        <w:tblW w:type="auto" w:w="0"/>
+        <w:tblLook w:firstColumn="1" w:firstRow="1" w:lastColumn="0" w:lastRow="0" w:noHBand="0" w:noVBand="1" w:val="04A0"/>
+      </w:tblPr>
+      <w:tblGrid>
+        <w:gridCol w:w="1234"/>
+        <w:gridCol w:w="1234"/>
+        <w:gridCol w:w="1234"/>
+        <w:gridCol w:w="1234"/>
+        <w:gridCol w:w="1234"/>
+        <w:gridCol w:w="1234"/>
+        <w:gridCol w:w="1234"/>
+      </w:tblGrid>
+      <w:tr>
+        <w:tc>
+          <w:tcPr>
+            <w:tcW w:type="dxa" w:w="1234"/>
+          </w:tcPr>
+          <w:p>
+            <w:r>
+              <w:rPr>
+                <w:b/>
+              </w:rPr>
+            </w:r>
+            <w:r>
+              <w:rPr>
+                <w:b/>
+              </w:rPr>
+              <w:t>방법</w:t>
+            </w:r>
+          </w:p>
+        </w:tc>
+        <w:tc>
+          <w:tcPr>
+            <w:tcW w:type="dxa" w:w="1234"/>
+          </w:tcPr>
+          <w:p>
+            <w:r>
+              <w:rPr>
+                <w:b/>
+              </w:rPr>
+            </w:r>
+            <w:r>
+              <w:rPr>
+                <w:b/>
+              </w:rPr>
+              <w:t>경로 r</w:t>
+            </w:r>
+          </w:p>
+        </w:tc>
+        <w:tc>
+          <w:tcPr>
+            <w:tcW w:type="dxa" w:w="1234"/>
+          </w:tcPr>
+          <w:p>
+            <w:r>
+              <w:rPr>
+                <w:b/>
+              </w:rPr>
+            </w:r>
+            <w:r>
+              <w:rPr>
+                <w:b/>
+              </w:rPr>
+              <w:t>경로 SD 비</w:t>
+            </w:r>
+          </w:p>
+        </w:tc>
+        <w:tc>
+          <w:tcPr>
+            <w:tcW w:type="dxa" w:w="1234"/>
+          </w:tcPr>
+          <w:p>
+            <w:r>
+              <w:rPr>
+                <w:b/>
+              </w:rPr>
+            </w:r>
+            <w:r>
+              <w:rPr>
+                <w:b/>
+              </w:rPr>
+              <w:t>최악 경로 r</w:t>
+            </w:r>
+          </w:p>
+        </w:tc>
+        <w:tc>
+          <w:tcPr>
+            <w:tcW w:type="dxa" w:w="1234"/>
+          </w:tcPr>
+          <w:p>
+            <w:r>
+              <w:rPr>
+                <w:b/>
+              </w:rPr>
+            </w:r>
+            <w:r>
+              <w:rPr>
+                <w:b/>
+              </w:rPr>
+              <w:t>환자 상관 일치</w:t>
+            </w:r>
+          </w:p>
+        </w:tc>
+        <w:tc>
+          <w:tcPr>
+            <w:tcW w:type="dxa" w:w="1234"/>
+          </w:tcPr>
+          <w:p>
+            <w:r>
+              <w:rPr>
+                <w:b/>
+              </w:rPr>
+            </w:r>
+            <w:r>
+              <w:rPr>
+                <w:b/>
+              </w:rPr>
+              <w:t>kNN 겹침</w:t>
+            </w:r>
+          </w:p>
+        </w:tc>
+        <w:tc>
+          <w:tcPr>
+            <w:tcW w:type="dxa" w:w="1234"/>
+          </w:tcPr>
+          <w:p>
+            <w:r>
+              <w:rPr>
+                <w:b/>
+              </w:rPr>
+            </w:r>
+            <w:r>
+              <w:rPr>
+                <w:b/>
+              </w:rPr>
+              <w:t>DE t 상관</w:t>
+            </w:r>
+          </w:p>
+        </w:tc>
+      </w:tr>
+      <w:tr>
+        <w:tc>
+          <w:tcPr>
+            <w:tcW w:type="dxa" w:w="1234"/>
+          </w:tcPr>
+          <w:p>
+            <w:r/>
+            <w:r>
+              <w:t>MIMIR</w:t>
+            </w:r>
+          </w:p>
+        </w:tc>
+        <w:tc>
+          <w:tcPr>
+            <w:tcW w:type="dxa" w:w="1234"/>
+          </w:tcPr>
+          <w:p>
+            <w:r/>
+            <w:r>
+              <w:t>0.795</w:t>
+            </w:r>
+          </w:p>
+        </w:tc>
+        <w:tc>
+          <w:tcPr>
+            <w:tcW w:type="dxa" w:w="1234"/>
+          </w:tcPr>
+          <w:p>
+            <w:r/>
+            <w:r>
+              <w:t>0.883</w:t>
+            </w:r>
+          </w:p>
+        </w:tc>
+        <w:tc>
+          <w:tcPr>
+            <w:tcW w:type="dxa" w:w="1234"/>
+          </w:tcPr>
+          <w:p>
+            <w:r/>
+            <w:r>
+              <w:t>0.510</w:t>
+            </w:r>
+          </w:p>
+        </w:tc>
+        <w:tc>
+          <w:tcPr>
+            <w:tcW w:type="dxa" w:w="1234"/>
+          </w:tcPr>
+          <w:p>
+            <w:r/>
+            <w:r>
+              <w:t>0.893</w:t>
+            </w:r>
+          </w:p>
+        </w:tc>
+        <w:tc>
+          <w:tcPr>
+            <w:tcW w:type="dxa" w:w="1234"/>
+          </w:tcPr>
+          <w:p>
+            <w:r/>
+            <w:r>
+              <w:t>0.662</w:t>
+            </w:r>
+          </w:p>
+        </w:tc>
+        <w:tc>
+          <w:tcPr>
+            <w:tcW w:type="dxa" w:w="1234"/>
+          </w:tcPr>
+          <w:p>
+            <w:r/>
+            <w:r>
+              <w:t>0.914</w:t>
+            </w:r>
+          </w:p>
+        </w:tc>
+      </w:tr>
+      <w:tr>
+        <w:tc>
+          <w:tcPr>
+            <w:tcW w:type="dxa" w:w="1234"/>
+          </w:tcPr>
+          <w:p>
+            <w:r/>
+            <w:r>
+              <w:t>Ridge 2→1</w:t>
+            </w:r>
+          </w:p>
+        </w:tc>
+        <w:tc>
+          <w:tcPr>
+            <w:tcW w:type="dxa" w:w="1234"/>
+          </w:tcPr>
+          <w:p>
+            <w:r/>
+            <w:r>
+              <w:t>0.717</w:t>
+            </w:r>
+          </w:p>
+        </w:tc>
+        <w:tc>
+          <w:tcPr>
+            <w:tcW w:type="dxa" w:w="1234"/>
+          </w:tcPr>
+          <w:p>
+            <w:r/>
+            <w:r>
+              <w:t>0.756</w:t>
+            </w:r>
+          </w:p>
+        </w:tc>
+        <w:tc>
+          <w:tcPr>
+            <w:tcW w:type="dxa" w:w="1234"/>
+          </w:tcPr>
+          <w:p>
+            <w:r/>
+            <w:r>
+              <w:t>0.375</w:t>
+            </w:r>
+          </w:p>
+        </w:tc>
+        <w:tc>
+          <w:tcPr>
+            <w:tcW w:type="dxa" w:w="1234"/>
+          </w:tcPr>
+          <w:p>
+            <w:r/>
+            <w:r>
+              <w:t>0.859</w:t>
+            </w:r>
+          </w:p>
+        </w:tc>
+        <w:tc>
+          <w:tcPr>
+            <w:tcW w:type="dxa" w:w="1234"/>
+          </w:tcPr>
+          <w:p>
+            <w:r/>
+            <w:r>
+              <w:t>0.602</w:t>
+            </w:r>
+          </w:p>
+        </w:tc>
+        <w:tc>
+          <w:tcPr>
+            <w:tcW w:type="dxa" w:w="1234"/>
+          </w:tcPr>
+          <w:p>
+            <w:r/>
+            <w:r>
+              <w:t>0.905</w:t>
+            </w:r>
+          </w:p>
+        </w:tc>
+      </w:tr>
+      <w:tr>
+        <w:tc>
+          <w:tcPr>
+            <w:tcW w:type="dxa" w:w="1234"/>
+          </w:tcPr>
+          <w:p>
+            <w:r/>
+            <w:r>
+              <w:t>MOCHI</w:t>
+            </w:r>
+          </w:p>
+        </w:tc>
+        <w:tc>
+          <w:tcPr>
+            <w:tcW w:type="dxa" w:w="1234"/>
+          </w:tcPr>
+          <w:p>
+            <w:r/>
+            <w:r>
+              <w:t>0.663</w:t>
+            </w:r>
+          </w:p>
+        </w:tc>
+        <w:tc>
+          <w:tcPr>
+            <w:tcW w:type="dxa" w:w="1234"/>
+          </w:tcPr>
+          <w:p>
+            <w:r/>
+            <w:r>
+              <w:t>0.973</w:t>
+            </w:r>
+          </w:p>
+        </w:tc>
+        <w:tc>
+          <w:tcPr>
+            <w:tcW w:type="dxa" w:w="1234"/>
+          </w:tcPr>
+          <w:p>
+            <w:r/>
+            <w:r>
+              <w:t>0.409</w:t>
+            </w:r>
+          </w:p>
+        </w:tc>
+        <w:tc>
+          <w:tcPr>
+            <w:tcW w:type="dxa" w:w="1234"/>
+          </w:tcPr>
+          <w:p>
+            <w:r/>
+            <w:r>
+              <w:t>0.833</w:t>
+            </w:r>
+          </w:p>
+        </w:tc>
+        <w:tc>
+          <w:tcPr>
+            <w:tcW w:type="dxa" w:w="1234"/>
+          </w:tcPr>
+          <w:p>
+            <w:r/>
+            <w:r>
+              <w:t>0.584</w:t>
+            </w:r>
+          </w:p>
+        </w:tc>
+        <w:tc>
+          <w:tcPr>
+            <w:tcW w:type="dxa" w:w="1234"/>
+          </w:tcPr>
+          <w:p>
+            <w:r/>
+            <w:r>
+              <w:t>0.885</w:t>
+            </w:r>
+          </w:p>
+        </w:tc>
+      </w:tr>
+      <w:tr>
+        <w:tc>
+          <w:tcPr>
+            <w:tcW w:type="dxa" w:w="1234"/>
+          </w:tcPr>
+          <w:p>
+            <w:r/>
+            <w:r>
+              <w:t>평균 대치</w:t>
+            </w:r>
+          </w:p>
+        </w:tc>
+        <w:tc>
+          <w:tcPr>
+            <w:tcW w:type="dxa" w:w="1234"/>
+          </w:tcPr>
+          <w:p>
+            <w:r/>
+            <w:r>
+              <w:t>0.000</w:t>
+            </w:r>
+          </w:p>
+        </w:tc>
+        <w:tc>
+          <w:tcPr>
+            <w:tcW w:type="dxa" w:w="1234"/>
+          </w:tcPr>
+          <w:p>
+            <w:r/>
+            <w:r>
+              <w:t>0.000</w:t>
+            </w:r>
+          </w:p>
+        </w:tc>
+        <w:tc>
+          <w:tcPr>
+            <w:tcW w:type="dxa" w:w="1234"/>
+          </w:tcPr>
+          <w:p>
+            <w:r/>
+            <w:r>
+              <w:t>—</w:t>
+            </w:r>
+          </w:p>
+        </w:tc>
+        <w:tc>
+          <w:tcPr>
+            <w:tcW w:type="dxa" w:w="1234"/>
+          </w:tcPr>
+          <w:p>
+            <w:r/>
+            <w:r>
+              <w:t>—</w:t>
+            </w:r>
+          </w:p>
+        </w:tc>
+        <w:tc>
+          <w:tcPr>
+            <w:tcW w:type="dxa" w:w="1234"/>
+          </w:tcPr>
+          <w:p>
+            <w:r/>
+            <w:r>
+              <w:t>0.128</w:t>
+            </w:r>
+          </w:p>
+        </w:tc>
+        <w:tc>
+          <w:tcPr>
+            <w:tcW w:type="dxa" w:w="1234"/>
+          </w:tcPr>
+          <w:p>
+            <w:r/>
+            <w:r>
+              <w:t>—</w:t>
+            </w:r>
+          </w:p>
+        </w:tc>
+      </w:tr>
+    </w:tbl>
+    <w:p>
+      <w:r>
+        <w:rPr>
+          <w:b/>
+        </w:rPr>
+        <w:t>표 11.</w:t>
+      </w:r>
+      <w:r>
+        <w:t xml:space="preserve"> 저랭크 잔차 녹아웃. 재학습 없이 \gamma_t=0. RNA 경로 SD 비와 블록 z-RMSE. 원자료 `bio_lowrank_{brca,luad,kirc}/biology.tsv`, `lowrank_recon.csv`.</w:t>
+      </w:r>
+    </w:p>
+    <w:tbl>
+      <w:tblPr>
+        <w:tblStyle w:val="LightGrid-Accent1"/>
+        <w:tblW w:type="auto" w:w="0"/>
+        <w:tblLook w:firstColumn="1" w:firstRow="1" w:lastColumn="0" w:lastRow="0" w:noHBand="0" w:noVBand="1" w:val="04A0"/>
+      </w:tblPr>
+      <w:tblGrid>
+        <w:gridCol w:w="1234"/>
+        <w:gridCol w:w="1234"/>
+        <w:gridCol w:w="1234"/>
+        <w:gridCol w:w="1234"/>
+        <w:gridCol w:w="1234"/>
+        <w:gridCol w:w="1234"/>
+        <w:gridCol w:w="1234"/>
+      </w:tblGrid>
+      <w:tr>
+        <w:tc>
+          <w:tcPr>
+            <w:tcW w:type="dxa" w:w="1234"/>
+          </w:tcPr>
+          <w:p>
+            <w:r>
+              <w:rPr>
+                <w:b/>
+              </w:rPr>
+            </w:r>
+            <w:r>
+              <w:rPr>
+                <w:b/>
+              </w:rPr>
+              <w:t>코호트</w:t>
+            </w:r>
+          </w:p>
+        </w:tc>
+        <w:tc>
+          <w:tcPr>
+            <w:tcW w:type="dxa" w:w="1234"/>
+          </w:tcPr>
+          <w:p>
+            <w:r>
+              <w:rPr>
+                <w:b/>
+              </w:rPr>
+            </w:r>
+            <w:r>
+              <w:rPr>
+                <w:b/>
+              </w:rPr>
+              <w:t>경로 SD 비 (MOCHI)</w:t>
+            </w:r>
+          </w:p>
+        </w:tc>
+        <w:tc>
+          <w:tcPr>
+            <w:tcW w:type="dxa" w:w="1234"/>
+          </w:tcPr>
+          <w:p>
+            <w:r>
+              <w:rPr>
+                <w:b/>
+              </w:rPr>
+            </w:r>
+            <w:r>
+              <w:rPr>
+                <w:b/>
+              </w:rPr>
+              <w:t>경로 SD 비 (γ=0)</w:t>
+            </w:r>
+          </w:p>
+        </w:tc>
+        <w:tc>
+          <w:tcPr>
+            <w:tcW w:type="dxa" w:w="1234"/>
+          </w:tcPr>
+          <w:p>
+            <w:r>
+              <w:rPr>
+                <w:b/>
+              </w:rPr>
+            </w:r>
+            <w:r>
+              <w:rPr>
+                <w:b/>
+              </w:rPr>
+              <w:t>상대 감소</w:t>
+            </w:r>
+          </w:p>
+        </w:tc>
+        <w:tc>
+          <w:tcPr>
+            <w:tcW w:type="dxa" w:w="1234"/>
+          </w:tcPr>
+          <w:p>
+            <w:r>
+              <w:rPr>
+                <w:b/>
+              </w:rPr>
+            </w:r>
+            <w:r>
+              <w:rPr>
+                <w:b/>
+              </w:rPr>
+              <w:t>RNA z-RMSE Δ</w:t>
+            </w:r>
+          </w:p>
+        </w:tc>
+        <w:tc>
+          <w:tcPr>
+            <w:tcW w:type="dxa" w:w="1234"/>
+          </w:tcPr>
+          <w:p>
+            <w:r>
+              <w:rPr>
+                <w:b/>
+              </w:rPr>
+            </w:r>
+            <w:r>
+              <w:rPr>
+                <w:b/>
+              </w:rPr>
+              <w:t>메틸 z-RMSE Δ</w:t>
+            </w:r>
+          </w:p>
+        </w:tc>
+        <w:tc>
+          <w:tcPr>
+            <w:tcW w:type="dxa" w:w="1234"/>
+          </w:tcPr>
+          <w:p>
+            <w:r>
+              <w:rPr>
+                <w:b/>
+              </w:rPr>
+            </w:r>
+            <w:r>
+              <w:rPr>
+                <w:b/>
+              </w:rPr>
+              <w:t>단백질 z-RMSE Δ</w:t>
+            </w:r>
+          </w:p>
+        </w:tc>
+      </w:tr>
+      <w:tr>
+        <w:tc>
+          <w:tcPr>
+            <w:tcW w:type="dxa" w:w="1234"/>
+          </w:tcPr>
+          <w:p>
+            <w:r/>
+            <w:r>
+              <w:t>BRCA</w:t>
+            </w:r>
+          </w:p>
+        </w:tc>
+        <w:tc>
+          <w:tcPr>
+            <w:tcW w:type="dxa" w:w="1234"/>
+          </w:tcPr>
+          <w:p>
+            <w:r/>
+            <w:r>
+              <w:t>0.973</w:t>
+            </w:r>
+          </w:p>
+        </w:tc>
+        <w:tc>
+          <w:tcPr>
+            <w:tcW w:type="dxa" w:w="1234"/>
+          </w:tcPr>
+          <w:p>
+            <w:r/>
+            <w:r>
+              <w:t>0.556</w:t>
+            </w:r>
+          </w:p>
+        </w:tc>
+        <w:tc>
+          <w:tcPr>
+            <w:tcW w:type="dxa" w:w="1234"/>
+          </w:tcPr>
+          <w:p>
+            <w:r/>
+            <w:r>
+              <w:t>−43%</w:t>
+            </w:r>
+          </w:p>
+        </w:tc>
+        <w:tc>
+          <w:tcPr>
+            <w:tcW w:type="dxa" w:w="1234"/>
+          </w:tcPr>
+          <w:p>
+            <w:r/>
+            <w:r>
+              <w:t>+0.012</w:t>
+            </w:r>
+          </w:p>
+        </w:tc>
+        <w:tc>
+          <w:tcPr>
+            <w:tcW w:type="dxa" w:w="1234"/>
+          </w:tcPr>
+          <w:p>
+            <w:r/>
+            <w:r>
+              <w:t>+0.007</w:t>
+            </w:r>
+          </w:p>
+        </w:tc>
+        <w:tc>
+          <w:tcPr>
+            <w:tcW w:type="dxa" w:w="1234"/>
+          </w:tcPr>
+          <w:p>
+            <w:r/>
+            <w:r>
+              <w:t>−0.023</w:t>
+            </w:r>
+          </w:p>
+        </w:tc>
+      </w:tr>
+      <w:tr>
+        <w:tc>
+          <w:tcPr>
+            <w:tcW w:type="dxa" w:w="1234"/>
+          </w:tcPr>
+          <w:p>
+            <w:r/>
+            <w:r>
+              <w:t>LUAD</w:t>
+            </w:r>
+          </w:p>
+        </w:tc>
+        <w:tc>
+          <w:tcPr>
+            <w:tcW w:type="dxa" w:w="1234"/>
+          </w:tcPr>
+          <w:p>
+            <w:r/>
+            <w:r>
+              <w:t>0.846</w:t>
+            </w:r>
+          </w:p>
+        </w:tc>
+        <w:tc>
+          <w:tcPr>
+            <w:tcW w:type="dxa" w:w="1234"/>
+          </w:tcPr>
+          <w:p>
+            <w:r/>
+            <w:r>
+              <w:t>0.483</w:t>
+            </w:r>
+          </w:p>
+        </w:tc>
+        <w:tc>
+          <w:tcPr>
+            <w:tcW w:type="dxa" w:w="1234"/>
+          </w:tcPr>
+          <w:p>
+            <w:r/>
+            <w:r>
+              <w:t>−43%</w:t>
+            </w:r>
+          </w:p>
+        </w:tc>
+        <w:tc>
+          <w:tcPr>
+            <w:tcW w:type="dxa" w:w="1234"/>
+          </w:tcPr>
+          <w:p>
+            <w:r/>
+            <w:r>
+              <w:t>+0.013</w:t>
+            </w:r>
+          </w:p>
+        </w:tc>
+        <w:tc>
+          <w:tcPr>
+            <w:tcW w:type="dxa" w:w="1234"/>
+          </w:tcPr>
+          <w:p>
+            <w:r/>
+            <w:r>
+              <w:t>+0.015</w:t>
+            </w:r>
+          </w:p>
+        </w:tc>
+        <w:tc>
+          <w:tcPr>
+            <w:tcW w:type="dxa" w:w="1234"/>
+          </w:tcPr>
+          <w:p>
+            <w:r/>
+            <w:r>
+              <w:t>−0.024</w:t>
+            </w:r>
+          </w:p>
+        </w:tc>
+      </w:tr>
+      <w:tr>
+        <w:tc>
+          <w:tcPr>
+            <w:tcW w:type="dxa" w:w="1234"/>
+          </w:tcPr>
+          <w:p>
+            <w:r/>
+            <w:r>
+              <w:t>KIRC</w:t>
+            </w:r>
+          </w:p>
+        </w:tc>
+        <w:tc>
+          <w:tcPr>
+            <w:tcW w:type="dxa" w:w="1234"/>
+          </w:tcPr>
+          <w:p>
+            <w:r/>
+            <w:r>
+              <w:t>0.796</w:t>
+            </w:r>
+          </w:p>
+        </w:tc>
+        <w:tc>
+          <w:tcPr>
+            <w:tcW w:type="dxa" w:w="1234"/>
+          </w:tcPr>
+          <w:p>
+            <w:r/>
+            <w:r>
+              <w:t>0.445</w:t>
+            </w:r>
+          </w:p>
+        </w:tc>
+        <w:tc>
+          <w:tcPr>
+            <w:tcW w:type="dxa" w:w="1234"/>
+          </w:tcPr>
+          <w:p>
+            <w:r/>
+            <w:r>
+              <w:t>−44%</w:t>
+            </w:r>
+          </w:p>
+        </w:tc>
+        <w:tc>
+          <w:tcPr>
+            <w:tcW w:type="dxa" w:w="1234"/>
+          </w:tcPr>
+          <w:p>
+            <w:r/>
+            <w:r>
+              <w:t>+0.025</w:t>
+            </w:r>
+          </w:p>
+        </w:tc>
+        <w:tc>
+          <w:tcPr>
+            <w:tcW w:type="dxa" w:w="1234"/>
+          </w:tcPr>
+          <w:p>
+            <w:r/>
+            <w:r>
+              <w:t>+0.042</w:t>
+            </w:r>
+          </w:p>
+        </w:tc>
+        <w:tc>
+          <w:tcPr>
+            <w:tcW w:type="dxa" w:w="1234"/>
+          </w:tcPr>
+          <w:p>
+            <w:r/>
+            <w:r>
+              <w:t>−0.032</w:t>
+            </w:r>
+          </w:p>
+        </w:tc>
+      </w:tr>
+    </w:tbl>
+    <w:p>
+      <w:r>
+        <w:rPr>
+          <w:b/>
+        </w:rPr>
+        <w:t>그림 1.</w:t>
+      </w:r>
+      <w:r>
+        <w:t xml:space="preserve"> 저랭크 NMF 잔차가 Hallmark 경로 활성의 진폭을 보존한다. 파일: `paper/figures/fig1_pathway_knockout.pdf`.</w:t>
+      </w:r>
+    </w:p>
+    <w:p>
+      <w:r>
+        <w:rPr>
+          <w:b/>
+        </w:rPr>
+        <w:t>(A)</w:t>
+      </w:r>
+      <w:r>
+        <w:t xml:space="preserve"> TCGA-BRCA 검사 집합에서 RNA를 통째로 가린 뒤 채웠을 때, 환자 간 경로 활성 표준편차의 참값 대비 비. 막대 옆 r은 경로 점수 상관이다. MOCHI는 진폭(0.973)에서 앞서고, 상관에서는 MIMIR이 앞선다.</w:t>
+      </w:r>
+    </w:p>
+    <w:p>
+      <w:r>
+        <w:rPr>
+          <w:b/>
+        </w:rPr>
+        <w:t>(B)</w:t>
+      </w:r>
+      <w:r>
+        <w:t xml:space="preserve"> 같은 가중치에서 \gamma_t만 0으로 둔 녹아웃. 세 암종 모두 경로 표준편차 비가 약 43% 감소한다.</w:t>
+      </w:r>
+    </w:p>
+    <w:p>
+      <w:r>
+        <w:rPr>
+          <w:b/>
+        </w:rPr>
+        <w:t>(C)</w:t>
+      </w:r>
+      <w:r>
+        <w:t xml:space="preserve"> 녹아웃 전후 블록 z-RMSE 차이(녹아웃 − 보고 모형). 양수는 저랭크가 오차를 줄였다는 뜻이다. RNA·메틸화는 양수, 단백질은 음수다.</w:t>
+      </w:r>
+    </w:p>
+    <w:p>
       <w:pPr>
         <w:pStyle w:val="Heading1"/>
       </w:pPr>
@@ -7053,6 +8107,14 @@
       </w:pPr>
       <w:r>
         <w:t>하위 과제 레이블은 UCSC Xena TCGA BRCA clinicalMatrix에서 가져왔다. PAM50은 RNA 유래이므로 ER·HER2·병기를 우선으로 읽는다.</w:t>
+      </w:r>
+    </w:p>
+    <w:p>
+      <w:pPr>
+        <w:pStyle w:val="ListBullet"/>
+      </w:pPr>
+      <w:r>
+        <w:t>그림 1은 `paper/figures/plot_pathway_knockout.py`로 그렸다. 숫자는 `source_pathway_knockout.csv`에 고정했다. `.docx`는 이 그림 반영 전이다.</w:t>
       </w:r>
     </w:p>
     <w:sectPr>

</xml_diff>

<commit_message>
docs: fill KIRC split counts from sample_split.tsv
Why:
- Section 2.7 left train/val/n as TODO, and the abstract read as if KIRC had the full cell-missing benchmark.

What:
- KIRC is 291 tumors (203/43/45). Abstract and conclusion now say knockout replication only.

Co-authored-by: Cursor <cursoragent@cursor.com>
</commit_message>
<xml_diff>
--- a/mochi_code/paper/manuscript_draft_260818.docx
+++ b/mochi_code/paper/manuscript_draft_260818.docx
@@ -85,7 +85,7 @@
     </w:p>
     <w:p>
       <w:r>
-        <w:t>TCGA BRCA 원발 종양 631명, LUAD 319명, KIRC를 같은 규칙으로 나누어 평가하였다. 보고 모형 MOCHI는 오믹스별 선형 오토인코더의 은닉 표현을 주 경로로 두고, 학습 집합에서만 맞춘 고정 NMF 계수를 Transformer의 보조 토큰으로 넣는 동시에 코호트 평균에서의 계수 편차를 저랭크 잔차로 디코더 출력에 더하며, 조건부 Wasserstein GAN을 약하게 곁들인다. 칸 결측(MCAR·MNAR 30%)에서 BRCA 검사 집합 평균 z-RMSE는 각각 0.676, 0.689로, 순수 번역기(Ridge, OmicsNMF, OmiTrans, MOCHI-v5)를 뚜렷이 앞섰고 공유 잠재공간 오토인코더(MIMIR)에는 미치지 못했다. 블록 결측에서는 MIMIR(0.715)과 Ridge 2→1(0.818)이 재구성에서 앞섰고, MOCHI는 0.858이었다. LUAD 검사 집합에서도 칸 MCAR 30%는 MIMIR 0.651, MOCHI 0.697, Ridge 2→1 0.851이고, 블록 평균은 각각 0.719, 0.878, 0.836으로 순위가 같다. 번역기 비교에서는 RNA 복원에 두 번째 오믹스를 쓰는 2→1이 1→1보다 나았으나, 단백질은 RNA만 쓰는 편이 유리하였다. 구성 요소를 끈 실험에서 칸 결측의 이득은 거의 자기 은닉 가중에 있었고, 표준 결측률의 재구성 오차만 보면 Transformer와 적대항의 기여는 없었다. 그러나 조건을 바꾸면 부호가 달라진다. Transformer는 결측률 70–90% 구간에서 이득으로 돌아섰고(MCAR 90%에서 0.914 대 0.927), 적대항과 NMF 토큰은 오차가 아니라 분포에서 값을 냈다. 적대항을 끄면 특징별 표준편차 비가 0.754에서 0.692로, NMF 토큰을 빼면 0.548까지 떨어진다. Ridge 2→1은 z-RMSE가 더 낮으면서도 표준편차 비는 0.604로 더 심하게 수축한다. 한편 선행 연구가 쓰는 하위 과제 AUROC(ER, HER2, PAM50, 병기)는 방법 간 격차가 부트스트랩 신뢰구간보다 작았고, 세 과제에서 대치값이 실제 값보다 높은 AUROC를 냈다. 생물학적 보존을 다섯 축으로 다시 재었을 때도 경로 상관, 환자 간 상관, kNN 겹침, 차등 발현 t 상관은 모두 재구성 오차의 순위를 그대로 재현하여 MIMIR이 앞섰다. 그 순위를 깨는 축은 경로 활성의 진폭 하나였고, 여기서만 MOCHI가 0.973으로 MIMIR(0.882)과 Ridge 2→1(0.756)보다 참값에 가까웠다. 재학습 없이 저랭크 잔차의 계수 \gamma를 0으로 두면 이 진폭이 세 암종 모두에서 43–44% 무너지는 반면 재구성 오차는 거의 변하지 않아, 진폭을 떠받치는 것이 NMF 성분 항임을 같은 가중치 위에서 확인하였다. 재구성 오차의 1등은 MIMIR로 두는 것이 데이터와 맞다. MOCHI의 기여는 칸과 블록을 한 모형이 같이 채우고, 오차를 거의 대가로 치르지 않으면서 경로 진폭을 지키며, 그 진폭이 어느 성분에서 나오는지 녹아웃으로 지목할 수 있게 한 점이다.</w:t>
+        <w:t>TCGA BRCA 원발 종양 631명과 LUAD 319명으로 칸·블록 결측을 평가하고, 같은 규칙의 KIRC 원발 종양 291명에서 저랭크 잔차 녹아웃을 재현하였다. 보고 모형 MOCHI는 오믹스별 선형 오토인코더의 은닉 표현을 주 경로로 두고, 학습 집합에서만 맞춘 고정 NMF 계수를 Transformer의 보조 토큰으로 넣는 동시에 코호트 평균에서의 계수 편차를 저랭크 잔차로 디코더 출력에 더하며, 조건부 Wasserstein GAN을 약하게 곁들인다. 칸 결측(MCAR·MNAR 30%)에서 BRCA 검사 집합 평균 z-RMSE는 각각 0.676, 0.689로, 순수 번역기(Ridge, OmicsNMF, OmiTrans, MOCHI-v5)를 뚜렷이 앞섰고 공유 잠재공간 오토인코더(MIMIR)에는 미치지 못했다. 블록 결측에서는 MIMIR(0.715)과 Ridge 2→1(0.818)이 재구성에서 앞섰고, MOCHI는 0.858이었다. LUAD 검사 집합에서도 칸 MCAR 30%는 MIMIR 0.651, MOCHI 0.697, Ridge 2→1 0.851이고, 블록 평균은 각각 0.719, 0.878, 0.836으로 순위가 같다. 번역기 비교에서는 RNA 복원에 두 번째 오믹스를 쓰는 2→1이 1→1보다 나았으나, 단백질은 RNA만 쓰는 편이 유리하였다. 구성 요소를 끈 실험에서 칸 결측의 이득은 거의 자기 은닉 가중에 있었고, 표준 결측률의 재구성 오차만 보면 Transformer와 적대항의 기여는 없었다. 그러나 조건을 바꾸면 부호가 달라진다. Transformer는 결측률 70–90% 구간에서 이득으로 돌아섰고(MCAR 90%에서 0.914 대 0.927), 적대항과 NMF 토큰은 오차가 아니라 분포에서 값을 냈다. 적대항을 끄면 특징별 표준편차 비가 0.754에서 0.692로, NMF 토큰을 빼면 0.548까지 떨어진다. Ridge 2→1은 z-RMSE가 더 낮으면서도 표준편차 비는 0.604로 더 심하게 수축한다. 한편 선행 연구가 쓰는 하위 과제 AUROC(ER, HER2, PAM50, 병기)는 방법 간 격차가 부트스트랩 신뢰구간보다 작았고, 세 과제에서 대치값이 실제 값보다 높은 AUROC를 냈다. 생물학적 보존을 다섯 축으로 다시 재었을 때도 경로 상관, 환자 간 상관, kNN 겹침, 차등 발현 t 상관은 모두 재구성 오차의 순위를 그대로 재현하여 MIMIR이 앞섰다. 그 순위를 깨는 축은 경로 활성의 진폭 하나였고, 여기서만 MOCHI가 0.973으로 MIMIR(0.882)과 Ridge 2→1(0.756)보다 참값에 가까웠다. 재학습 없이 저랭크 잔차의 계수 \gamma를 0으로 두면 이 진폭이 세 암종 모두에서 43–44% 무너지는 반면 재구성 오차는 거의 변하지 않아, 진폭을 떠받치는 것이 NMF 성분 항임을 같은 가중치 위에서 확인하였다. 재구성 오차의 1등은 MIMIR로 두는 것이 데이터와 맞다. MOCHI의 기여는 칸과 블록을 한 모형이 같이 채우고, 오차를 거의 대가로 치르지 않으면서 경로 진폭을 지키며, 그 진폭이 어느 성분에서 나오는지 녹아웃으로 지목할 수 있게 한 점이다.</w:t>
       </w:r>
     </w:p>
     <w:p>
@@ -403,7 +403,7 @@
     </w:p>
     <w:p>
       <w:r>
-        <w:t>신장투명세포암(KIRC)도 같은 규칙으로 준비하여 검사 45명을 얻었다〔TODO: 삼중 교집합 총원과 학습·검증 인원을 `processed_data/gate_kirc/sample_split.tsv`에서 확인해 채울 것〕. KIRC는 저랭크 잔차 녹아웃의 재현에만 쓰고, 칸 결측 벤치마크에는 넣지 않았다. 특징 선택이 코호트별 분산 상위 k이므로 hallmark에 매핑되는 유전자와 검정에 남는 경로 수가 암종마다 다르다(LUAD 1,960 유전자·34 경로, KIRC 1,956 유전자·32 경로). 따라서 경로 지표의 절대값은 암종 간에 직접 비교하지 않고, 같은 암종 안에서 녹아웃 전후만 비교한다.</w:t>
+        <w:t>신장투명세포암(KIRC)도 같은 규칙으로 준비하였다. 원발 종양 삼중 교집합은 291명이고, 시드 42로 학습 203, 검증 43, 검사 45명이다. KIRC는 저랭크 잔차 녹아웃의 재현에만 쓰고, 칸 결측 벤치마크에는 넣지 않았다. 특징 선택이 코호트별 분산 상위 k이므로 hallmark에 매핑되는 유전자와 검정에 남는 경로 수가 암종마다 다르다(LUAD 1,960 유전자·34 경로, KIRC 1,956 유전자·32 경로). 따라서 경로 지표의 절대값은 암종 간에 직접 비교하지 않고, 같은 암종 안에서 녹아웃 전후만 비교한다.</w:t>
       </w:r>
     </w:p>
     <w:p>
@@ -799,7 +799,7 @@
     </w:p>
     <w:p>
       <w:r>
-        <w:t>MOCHI는 칸 결측과 블록 결측을 한 네트워크에서 다루는 다중오믹스 보정기다. 오믹스별 오토인코더가 자기 공간을 지키고, 고정 NMF 계수는 Transformer의 보조 토큰이자 디코더 출력에 더해지는 저랭크 잔차가 되며, 조건부 Wasserstein GAN은 번역 분포를 다듬는다. TCGA BRCA 631명, LUAD 319명, KIRC, 고정 분할, 학습 전용 표준화와 특징 선택 위에서, 칸 결측 재구성은 자기 표현을 쓰는 모형이 번역기를 이겼고 그중 MIMIR이 가장 낮았다. 블록 결측 재구성 역시 두 암종에서 MIMIR이 1등이고, 번역기 중에서는 Ridge 2→1이 앞섰다. 2→1은 RNA에서 이득이 있고 단백질에서는 이득이 없다.</w:t>
+        <w:t>MOCHI는 칸 결측과 블록 결측을 한 네트워크에서 다루는 다중오믹스 보정기다. 오믹스별 오토인코더가 자기 공간을 지키고, 고정 NMF 계수는 Transformer의 보조 토큰이자 디코더 출력에 더해지는 저랭크 잔차가 되며, 조건부 Wasserstein GAN은 번역 분포를 다듬는다. TCGA BRCA 631명, LUAD 319명, KIRC 291명, 고정 분할, 학습 전용 표준화와 특징 선택 위에서, 칸 결측 재구성은 자기 표현을 쓰는 모형이 번역기를 이겼고 그중 MIMIR이 가장 낮았다. 블록 결측 재구성 역시 BRCA와 LUAD에서 MIMIR이 1등이고, 번역기 중에서는 Ridge 2→1이 앞섰다. KIRC는 녹아웃 재현에만 썼다. 2→1은 RNA에서 이득이 있고 단백질에서는 이득이 없다.</w:t>
       </w:r>
     </w:p>
     <w:p>

</xml_diff>

<commit_message>
docs: add MOCHI architecture figure matching the low-rank residual
그림 2는 구현(models_nmf_tf.py)을 블록으로 옮긴 것이다.
A는 오믹스별 AE·고정 NMF → 은닉 평균에 Transformer 잔차 →
디코더에 저랭크 잔차 γ(Ŵ−W̄)H를 더하는 세 단계를 그린다.
B는 같은 가중치의 블록(LOO)과 칸(ω=10 혼합) 추론을 나란히 둔다.
2.1절과 2.4절, 그림 캡션에서 이 그림을 가리키게 했다.

Co-authored-by: Doyeon <llovable@users.noreply.github.com>
</commit_message>
<xml_diff>
--- a/mochi_code/paper/manuscript_draft_260818.docx
+++ b/mochi_code/paper/manuscript_draft_260818.docx
@@ -141,7 +141,7 @@
     </w:p>
     <w:p>
       <w:r>
-        <w:t>이하 구성은 다음과 같다. 2절에서 모형과 자료, 결측 프로토콜을 서술하고, 3절에서 BRCA 검사 집합의 칸·블록 결과, 1→1 대 2→1 비교, 구성 요소 제거, LUAD 재현, 스트레스·분포·하위 과제 재평가, 그리고 세 암종의 생물학적 보존과 저랭크 경로 녹아웃을 보고한다. 4절에서 해석과 한계를 논한다.</w:t>
+        <w:t>이하 구성은 다음과 같다. 2절에서 모형(그림 2)과 자료, 결측 프로토콜을 서술하고, 3절에서 BRCA 검사 집합의 칸·블록 결과, 1→1 대 2→1 비교, 구성 요소 제거, LUAD 재현, 스트레스·분포·하위 과제 재평가, 그리고 세 암종의 생물학적 보존과 저랭크 경로 녹아웃을 보고한다. 4절에서 해석과 한계를 논한다.</w:t>
       </w:r>
     </w:p>
     <w:p>
@@ -162,7 +162,7 @@
     </w:p>
     <w:p>
       <w:r>
-        <w:t>MOCHI는 환자 i의 세 벡터 x_i^(\mathrmrna)∈ℝ^(2000), x_i^(\mathrmprot)∈ℝ^(487), x_i^(\mathrmmeth)∈ℝ^(5000)를 입력으로 받는다. 각 벡터는 학습 분할의 평균과 표준편차로 표준화한 z-점수이다. 원래 측정되지 않은 좌표는 0으로 두고, 관측 여부를 마스크로 함께 넘긴다.</w:t>
+        <w:t>MOCHI는 환자 i의 세 벡터 x_i^(\mathrmrna)∈ℝ^(2000), x_i^(\mathrmprot)∈ℝ^(487), x_i^(\mathrmmeth)∈ℝ^(5000)를 입력으로 받는다. 각 벡터는 학습 분할의 평균과 표준편차로 표준화한 z-점수이다. 원래 측정되지 않은 좌표는 0으로 두고, 관측 여부를 마스크로 함께 넘긴다. 인코딩·융합·디코딩과 두 추론 갈래는 그림 2에 있다.</w:t>
       </w:r>
     </w:p>
     <w:p>
@@ -280,7 +280,7 @@
     </w:p>
     <w:p>
       <w:r>
-        <w:t>평균을 빼면 이동량 s_t가 소거되어 잔차가 환자별 성분 활성의 편차만 담는다. A_t를 영으로, b_t를 \barW_t로 초기화하면 학습 시작 시 잔차가 정확히 0이므로 사전학습된 디코더를 흔들지 않는다. 이 초기화를 쓰지 않고 \|\hatWH - s\| 형태를 그대로 더했을 때는 -s_t가 만드는 상수 편향 때문에 InfoNCE가 0.17에서 3.05로 튀고 검증 블록 z-RMSE가 0.894에서 0.985로 무너졌다. \gamma_t는 오믹스별 학습 가능 스칼라이며 0.3에서 출발한다.</w:t>
+        <w:t>이 항이 그림 2A 오른쪽의 저랭크 잔차다. 평균을 빼면 이동량 s_t가 소거되어 잔차가 환자별 성분 활성의 편차만 담는다. A_t를 영으로, b_t를 \barW_t로 초기화하면 학습 시작 시 잔차가 정확히 0이므로 사전학습된 디코더를 흔들지 않는다. 이 초기화를 쓰지 않고 \|\hatWH - s\| 형태를 그대로 더했을 때는 -s_t가 만드는 상수 편향 때문에 InfoNCE가 0.17에서 3.05로 튀고 검증 블록 z-RMSE가 0.894에서 0.985로 무너졌다. \gamma_t는 오믹스별 학습 가능 스칼라이며 0.3에서 출발한다.</w:t>
       </w:r>
     </w:p>
     <w:p>
@@ -8051,6 +8051,39 @@
       </w:r>
       <w:r>
         <w:t xml:space="preserve"> 녹아웃 전후 블록 z-RMSE 차이(녹아웃 − 보고 모형). 양수는 저랭크가 오차를 줄였다는 뜻이다. RNA·메틸화는 양수, 단백질은 음수다.</w:t>
+      </w:r>
+    </w:p>
+    <w:p>
+      <w:r>
+        <w:rPr>
+          <w:b/>
+        </w:rPr>
+        <w:t>그림 2.</w:t>
+      </w:r>
+      <w:r>
+        <w:t xml:space="preserve"> MOCHI의 인코딩·융합·디코딩과 두 추론 갈래. 파일: `paper/figures/fig2_architecture.pdf`.</w:t>
+      </w:r>
+    </w:p>
+    <w:p>
+      <w:r>
+        <w:rPr>
+          <w:b/>
+        </w:rPr>
+        <w:t>(A)</w:t>
+      </w:r>
+      <w:r>
+        <w:t xml:space="preserve"> 오믹스별 선형 오토인코더가 은닉 h를 만들고, 학습 분할에서 얼린 NMF가 계수 W(k=20)를 닫힌 형으로 낸다. 융합의 주 경로는 존재하는 h의 평균 \barz이다. Transformer는 h와 W를 토큰으로 읽고 영으로 초기화한 \delta를 \barz에 잔차로 더한다. 디코딩은 선형 디코더에 저랭크 잔차 \gamma_t(\hatW_t-\barW_t)H_t를 더한다. 성분이 출력에 들어가는 곳이 이 항이다. \gamma_t=0이면 그림 1B의 녹아웃이 된다.</w:t>
+      </w:r>
+    </w:p>
+    <w:p>
+      <w:r>
+        <w:rPr>
+          <w:b/>
+        </w:rPr>
+        <w:t>(B)</w:t>
+      </w:r>
+      <w:r>
+        <w:t xml:space="preserve"> 같은 가중치로 두 결측을 받는다. 블록 결측은 타깃을 건너뛴 융합만 쓰고, 칸 결측은 자기 은닉·계수와 leave-one-omics-out을 \omega=10으로 섞는다.</w:t>
       </w:r>
     </w:p>
     <w:p>

</xml_diff>

<commit_message>
fix: train gamma, restore NMF nonnegativity, add self-info baselines
코드 리뷰 A/B/C를 그대로 적용했다. tests/test_patches.py 17개 통과.

A) gamma를 본체와 분리해 lr=1e-2로 학습하고, 선택적으로 softplus로
   비음수화한다. 녹아웃은 gamma.zero_()가 아니라 set_lowrank(False).
B) NMF 정규화 손실의 W에 ReLU를 넣어 FrozenNMF.encode와 정의를 통일.
C) 칸 결측에서 타깃 자기 정보를 쓰는 KNN, softImpute, Ridge-self를
   eval_nmf_tf에 넣는다. 오믹스별 방법은 블록에서 열 평균으로 퇴화한다.

방법 절도 이 세 가지에 맞춰 고쳤다. 표 1–11은 패치 전 체크포인트
수치이므로 BRCA 재학습 후 바꿔야 한다.

Co-authored-by: Doyeon <llovable@users.noreply.github.com>
</commit_message>
<xml_diff>
--- a/mochi_code/paper/manuscript_draft_260818.docx
+++ b/mochi_code/paper/manuscript_draft_260818.docx
@@ -126,7 +126,7 @@
     </w:p>
     <w:p>
       <w:r>
-        <w:t>본 연구는 그 간극을 메우기 위해 MOCHI(Multi-Omics Convergent Hybrid Imputer)를 제안한다. 이름은 세 오믹스가 하나의 융합 표현으로 모인 뒤 각자의 디코더로 돌아가는 구조를 가리킨다. 설계의 핵심은 다섯 가지다. 첫째, 오믹스별 얕은 오토인코더가 자기 공간을 먼저 배운다. 둘째, 학습 분할에서만 맞추고 얼린 NMF 계수 W를 Transformer의 성분 토큰으로 넣되, 재구성의 상한은 NMF 랭크에 묶지 않는다. 셋째, 융합 좌표에서 타깃의 계수를 예측하여 코호트 평균으로부터의 편차만 저랭크 잔차로 디코더 출력에 더한다. 성분이 해석되는 것과 성분이 값을 만드는 것은 다른 문장이며, 이 경로는 후자를 성립시키고 계수 \gamma를 0으로 두는 것만으로 검증할 수 있게 한다. 넷째, 빠진 오믹스의 은닉은 남은 오믹스 은닉의 평균에 Transformer 잔차를 더한 값으로 예측한다. 다섯째, 칸 결측 추론에서는 자기 은닉에 큰 가중을 두고 다른 오믹스의 단서를 약하게 섞는다. 적대 학습은 조건부 critic으로 번역 분포를 다듬는 보조항이며, 재구성 오차를 이기는 주인공으로 쓰지 않는다.</w:t>
+        <w:t>본 연구는 그 간극을 메우기 위해 MOCHI(Multi-Omics Convergent Hybrid Imputer)를 제안한다. 이름은 세 오믹스가 하나의 융합 표현으로 모인 뒤 각자의 디코더로 돌아가는 구조를 가리킨다. 설계의 핵심은 다섯 가지다. 첫째, 오믹스별 얕은 오토인코더가 자기 공간을 먼저 배운다. 둘째, 학습 분할에서만 맞추고 얼린 NMF 계수 W를 Transformer의 성분 토큰으로 넣되, 재구성의 상한은 NMF 랭크에 묶지 않는다. 셋째, 융합 좌표에서 타깃의 계수를 예측하여 코호트 평균으로부터의 편차만 저랭크 잔차로 디코더 출력에 더한다. 성분이 해석되는 것과 성분이 값을 만드는 것은 다른 문장이며, 이 경로는 후자를 성립시키고 잔차 경로를 끄는 것만으로 검증할 수 있게 한다. 넷째, 빠진 오믹스의 은닉은 남은 오믹스 은닉의 평균에 Transformer 잔차를 더한 값으로 예측한다. 다섯째, 칸 결측 추론에서는 자기 은닉에 큰 가중을 두고 다른 오믹스의 단서를 약하게 섞는다. 적대 학습은 조건부 critic으로 번역 분포를 다듬는 보조항이며, 재구성 오차를 이기는 주인공으로 쓰지 않는다.</w:t>
       </w:r>
     </w:p>
     <w:p>
@@ -185,7 +185,7 @@
     </w:p>
     <w:p>
       <w:r>
-        <w:t>오믹스 m마다 인코더 E_m과 디코더 D_m은 한 층의 선형 사상이다. 은닉 차원은 RNA 512, 메틸화 256, 단백질 128로 두었다. 단백질 특징 수가 487뿐인데 은닉을 과도하게 키우면 소표본에서 항등사상에 가깝게 붕괴한다. 1단계에서는 각 오토인코더를 마스크 평균제곱오차로 따로 학습한다. 2단계에서는 인코더·디코더를 융합 모듈과 함께 미세조정한다.</w:t>
+        <w:t>오믹스 m마다 인코더 E_m과 디코더 D_m은 한 층의 선형 사상이다. 은닉 차원은 RNA 512, 메틸화 256, 단백질 128로 두었다. 단백질 특징 수가 487뿐인데 은닉을 과도하게 키우면 소표본에서 항등사상에 가깝게 붕괴한다. 비선형성은 Transformer 융합과 계수 머리의 ReLU에만 있다. n=441, 특징 7,487인 소표본에서 오믹스별 MLP를 두면 과적합하기 쉽다는 판단이다. 1단계에서는 각 오토인코더를 마스크 평균제곱오차로 따로 학습한다. 2단계에서는 인코더·디코더를 융합 모듈과 함께 미세조정한다.</w:t>
       </w:r>
     </w:p>
     <w:p>
@@ -235,7 +235,7 @@
     </w:p>
     <w:p>
       <w:r>
-        <w:t>는 닫힌 형으로 계산하고, H_m은 학습 내내 얼린다. s_m은 학습 최솟값으로 정한 이동량이다. W_m의 각 성분은 해당 오믹스의 한 토큰이 되어, 성분 임베딩과 오믹스 임베딩을 더한 뒤 Transformer 인코더에 들어간다. NMF 손실은 자기 재구성과 번역 출력 모두에 대해 \|WH - (y+s)\|_2^2 형태로 약하게(λ_(\mathrmnmf)=0.1) 더한다.</w:t>
+        <w:t>는 닫힌 형으로 계산하고, H_m은 학습 내내 얼린다. s_m은 학습 최솟값으로 정한 이동량이다. W_m의 각 성분은 해당 오믹스의 한 토큰이 되어, 성분 임베딩과 오믹스 임베딩을 더한 뒤 Transformer 인코더에 들어간다. NMF 손실은 자기 재구성과 번역 출력 모두에 대해 \|WH - (y+s)\|_2^2 형태로 약하게(λ_(\mathrmnmf)=0.1) 더되, 여기의 W도 위의 ReLU 정의와 같다. ReLU를 빼면 이 항은 비음수 분해가 아니라 \mathrmspan(H)로의 선형 사영이 된다.</w:t>
       </w:r>
     </w:p>
     <w:p>
@@ -280,7 +280,7 @@
     </w:p>
     <w:p>
       <w:r>
-        <w:t>이 항이 그림 2A 오른쪽의 저랭크 잔차다. 평균을 빼면 이동량 s_t가 소거되어 잔차가 환자별 성분 활성의 편차만 담는다. A_t를 영으로, b_t를 \barW_t로 초기화하면 학습 시작 시 잔차가 정확히 0이므로 사전학습된 디코더를 흔들지 않는다. 이 초기화를 쓰지 않고 \|\hatWH - s\| 형태를 그대로 더했을 때는 -s_t가 만드는 상수 편향 때문에 InfoNCE가 0.17에서 3.05로 튀고 검증 블록 z-RMSE가 0.894에서 0.985로 무너졌다. \gamma_t는 오믹스별 학습 가능 스칼라이며 0.3에서 출발한다.</w:t>
+        <w:t>이 항이 그림 2A 오른쪽의 저랭크 잔차다. 평균을 빼면 이동량 s_t가 소거되어 잔차가 환자별 성분 활성의 편차만 담는다. A_t를 영으로, b_t를 \barW_t로 초기화하면 학습 시작 시 잔차가 정확히 0이므로 사전학습된 디코더를 흔들지 않는다. 이 초기화를 쓰지 않고 \|\hatWH - s\| 형태를 그대로 더했을 때는 -s_t가 만드는 상수 편향 때문에 InfoNCE가 0.17에서 3.05로 튀고 검증 블록 z-RMSE가 0.894에서 0.985로 무너졌다. \gamma_t는 오믹스별 스칼라이며 0.3에서 출발한다. 본체(3×10^(-4))와 같은 Adam 그룹에 두면 스칼라 세 개가 초기값에서 거의 움직이지 않으므로, \gamma만 학습률 10^(-2), 가중감쇠 0인 전용 그룹에 둔다. 비음수 해석을 유지할 때는 \gamma_t=\mathrmsoftplus(\tilde\gamma_t)로 재매개화한다. 녹아웃은 \tilde\gamma를 0으로 덮어쓰지 않는다. softplus(0)은 0.693이어서 경로를 끄는 것이 아니라 키우기 때문이다. 추론 시 잔차 경로 자체를 끈다.</w:t>
       </w:r>
     </w:p>
     <w:p>
@@ -434,7 +434,7 @@
     </w:p>
     <w:p>
       <w:r>
-        <w:t>평균 대치는 학습 평균(z-점수에서는 0)이다. Ridge는 학습 분할에서 소스→타깃 선형 모형을 맞춘다. 1→1은 단백질←RNA, RNA←단백질, 메틸화←RNA이고, 2→1은 단백질←(RNA, 메틸화), RNA←(단백질, 메틸화), 메틸화←(RNA, 단백질)이다. TOBMI는 같은 쌍에서 학습한다. OmicsNMF와 OmiTrans는 공식 구현의 네트워크와 손실을 그대로 가져오되, 공식 학습 루프가 검사 로더에서 생성기를 한 번 더 갱신하는 단계는 빼고, 우리의 고정 분할에서 학습한다. PIMMS는 이어붙인 다중오믹스 잡음제거 오토인코더다. MIMIR은 오믹스별 오토인코더와 공유 잠재공간으로 칸과 블록을 모두 채우는 모형으로, 같은 전처리 위에서 학습하였다. MOCHI-v5는 교차-어텐션과 선형 잔차, 조건부 WGAN, 고정 NMF 손실을 쓰는 순수 번역기다. 칸 결측에서 자기 좌표를 쓰지 않으므로, 번역기 계열의 상한을 보는 대조군이다.</w:t>
+        <w:t>평균 대치는 학습 평균(z-점수에서는 0)이다. Ridge는 학습 분할에서 소스→타깃 선형 모형을 맞춘다. 1→1은 단백질←RNA, RNA←단백질, 메틸화←RNA이고, 2→1은 단백질←(RNA, 메틸화), RNA←(단백질, 메틸화), 메틸화←(RNA, 단백질)이다. 이 번역기들은 칸 결측에서도 타깃의 남은 관측 칸을 보지 않는다. TOBMI, OmicsNMF, OmiTrans도 같다. 그래서 칸 결측 표에서 MOCHI(\omega=10)·MIMIR·PIMMS와 정보 집합이 다르다. 이 비대칭을 가르기 위해 타깃 자기 정보를 쓰는 네 가지를 추가한다. KNN과 오믹스별 softImpute는 표본 유사도·저랭크 행렬 완성이고, 블록에서는 열 평균으로 퇴화한다. softImpute-concat은 세 오믹스를 이어붙이고 학습 행을 앵커로 넣어 블록에서도 동작한다. Ridge-self는 세 오믹스 전부를 입력으로 받는 능형회귀이며, MOCHI와 같이 마스킹 증강으로 학습한다. OmicsNMF와 OmiTrans는 공식 구현의 네트워크와 손실을 그대로 가져오되, 공식 학습 루프가 검사 로더에서 생성기를 한 번 더 갱신하는 단계는 빼고, 우리의 고정 분할에서 학습한다. PIMMS는 이어붙인 다중오믹스 잡음제거 오토인코더다. MIMIR은 오믹스별 오토인코더와 공유 잠재공간으로 칸과 블록을 모두 채우는 모형으로, 같은 전처리 위에서 학습하였다. MOCHI-v5는 교차-어텐션과 선형 잔차, 조건부 WGAN, 고정 NMF 손실을 쓰는 순수 번역기다. 칸 결측에서 자기 좌표를 쓰지 않으므로, 번역기 계열의 상한을 보는 대조군이다.</w:t>
       </w:r>
     </w:p>
     <w:p>
@@ -478,7 +478,7 @@
     </w:p>
     <w:p>
       <w:r>
-        <w:t>MCAR 30%에서 MIMIR은 0.635, MOCHI는 0.676, 공유 은닉 평균 모형은 0.700이었다. NMF 계수를 번역의 주 경로로 쓴 변형(W-토큰 leave-one-out)은 0.669로 칸에서는 보고 모형과 거의 같았다. 번역기는 이 구간에 들어오지 못했다. Ridge 2→1 0.834, Ridge 1→1 0.854, MOCHI-v5 2→1 0.859, OmiTrans 0.886, 공식 OmicsNMF 0.910, TOBMI 1→1 0.921, 평균 대치 0.985였다. PIMMS는 0.816으로 번역기보다는 나았으나, 자기 은닉을 명시적으로 가중하는 모형에는 미치지 못했다.</w:t>
+        <w:t>MCAR 30%에서 MIMIR은 0.635, MOCHI는 0.676, 공유 은닉 평균 모형은 0.700이었다. NMF 계수를 번역의 주 경로로 쓴 변형(W-토큰 leave-one-out)은 0.669로 칸에서는 보고 모형과 거의 같았다. 번역기는 이 구간에 들어오지 못했다. Ridge 2→1 0.834, Ridge 1→1 0.854, MOCHI-v5 2→1 0.859, OmiTrans 0.886, 공식 OmicsNMF 0.910, TOBMI 1→1 0.921, 평균 대치 0.985였다. 이 번역기들은 타깃의 남은 관측 칸을 보지 않는다. MOCHI·MIMIR·PIMMS와의 칸 결측 격차 중 얼마가 교차 오믹스 보완이고 얼마가 자기 정보 접근인지는, 2.9절의 KNN·softImpute·Ridge-self와 같이 읽어야 한다. PIMMS는 0.816으로 번역기보다는 나았으나, 자기 은닉을 명시적으로 가중하는 모형에는 미치지 못했다.</w:t>
       </w:r>
     </w:p>
     <w:p>
@@ -723,7 +723,7 @@
     </w:p>
     <w:p>
       <w:r>
-        <w:t>2.4절의 저랭크 잔차 경로는 이 문제를 겨냥한다. 이제 성분은 출력에 명시적으로 더해지므로, \gamma_t를 0으로 두는 것만으로 재학습 없이 기여도를 잘라낼 수 있다. 같은 가중치, 같은 검사 집합에서 잘라낸 결과가 표 11과 그림 1B·C이다.</w:t>
+        <w:t>2.4절의 저랭크 잔차 경로는 이 문제를 겨냥한다. 이제 성분은 출력에 명시적으로 더해지므로, 잔차 경로를 끄는 것만으로 재학습 없이 기여도를 잘라낼 수 있다. 같은 가중치, 같은 검사 집합에서 잘라낸 결과가 표 11과 그림 1B·C이다.</w:t>
       </w:r>
     </w:p>
     <w:p>
@@ -738,7 +738,7 @@
     </w:p>
     <w:p>
       <w:r>
-        <w:t>저랭크 경로의 대가는 작다. 세 코호트 블록 z-RMSE 평균은 저랭크를 넣은 0.837/0.858/0.851 대 넣지 않은 BRCA 0.839이며, BRCA에서는 오히려 넣은 쪽이 낮다. 검증 곡선에서 \gamma_t는 0.3에서 출발해 오믹스별로 0.29–0.34로 갈라진다. 모형은 이 경로를 끄지 않고 조금 더 쓰는 방향을 골랐다.</w:t>
+        <w:t>저랭크 경로의 대가는 작다. 세 코호트 블록 z-RMSE 평균은 저랭크를 넣은 0.837/0.858/0.851 대 넣지 않은 BRCA 0.839이며, BRCA에서는 오히려 넣은 쪽이 낮다. 표 11의 수치는 \gamma를 본체와 같은 학습률로 둔 체크포인트에서 잰 것이다. 그 설정에서 \gamma_t는 0.3에서 0.29–0.34로만 움직였다. 전용 학습률을 넣은 뒤 BRCA에서 \gamma가 오믹스별로 어디로 수렴하는지는 재학습이 필요하다.</w:t>
       </w:r>
     </w:p>
     <w:p>
@@ -804,7 +804,7 @@
     </w:p>
     <w:p>
       <w:r>
-        <w:t>본문이 주장하는 것은 GAN의 재구성 우위가 아니다. 네 가지다. 첫째, 결측의 두 형태를 한 모형이 같이 받고, NMF를 랭크 상한이 되는 디코더가 아니라 작은 가중의 잔차로 얹으며, 번역의 주 경로를 은닉에 둔 설계가 세 암종에서 성립한다. 둘째, 그 잔차가 경로 활성의 진폭을 떠받친다는 것을 재학습 없는 녹아웃으로 보였다. \gamma를 0으로 두면 진폭이 세 암종 모두에서 43–44% 무너지는 반면 블록 z-RMSE는 거의 그대로다. 성분이 해석된다는 진술을 성분이 값을 만든다는 진술로 바꾼 것이 이 논문의 설계상 기여다. 셋째, 적대항과 성분 항의 값은 z-RMSE가 아니라 분포 보존에서 나타나며, Transformer의 값은 결측률 70% 이상의 극단 구간에서 나타난다. 한 지표 한 구간의 제거 실험으로 모듈을 판정하면 이 부호가 보이지 않는다. 넷째, 평가 지표에 대한 경고가 둘이다. 생물학 지표 중 정확도에서 파생되는 넷은 방법 순위가 z-RMSE와 완전히 같아 새 정보를 주지 않으며, 선행 연구가 흔히 쓰는 하위 과제 AUROC는 수백 명 코호트에서 보정기를 가르지 못하고 대치값이 실제 값보다 높은 AUROC를 내는 방향 오류까지 일으킨다. 이 네 가지는 모두 같은 자료·같은 분할·같은 마스크에서 공개 가능한 형태로 재현된다.</w:t>
+        <w:t>본문이 주장하는 것은 GAN의 재구성 우위가 아니다. 네 가지다. 첫째, 결측의 두 형태를 한 모형이 같이 받고, NMF를 랭크 상한이 되는 디코더가 아니라 작은 가중의 잔차로 얹으며, 번역의 주 경로를 은닉에 둔 설계가 세 암종에서 성립한다. 둘째, 그 잔차가 경로 활성의 진폭을 떠받친다는 것을 재학습 없는 녹아웃으로 보였다. 저랭크 경로를 끄면 진폭이 세 암종 모두에서 43–44% 무너지는 반면 블록 z-RMSE는 거의 그대로다. 성분이 해석된다는 진술을 성분이 값을 만든다는 진술로 바꾼 것이 이 논문의 설계상 기여다. 셋째, 적대항과 성분 항의 값은 z-RMSE가 아니라 분포 보존에서 나타나며, Transformer의 값은 결측률 70% 이상의 극단 구간에서 나타난다. 한 지표 한 구간의 제거 실험으로 모듈을 판정하면 이 부호가 보이지 않는다. 넷째, 평가 지표에 대한 경고가 둘이다. 생물학 지표 중 정확도에서 파생되는 넷은 방법 순위가 z-RMSE와 완전히 같아 새 정보를 주지 않으며, 선행 연구가 흔히 쓰는 하위 과제 AUROC는 수백 명 코호트에서 보정기를 가르지 못하고 대치값이 실제 값보다 높은 AUROC를 내는 방향 오류까지 일으킨다. 이 네 가지는 모두 같은 자료·같은 분할·같은 마스크에서 공개 가능한 형태로 재현된다.</w:t>
       </w:r>
     </w:p>
     <w:p>
@@ -7625,7 +7625,7 @@
         <w:t>표 11.</w:t>
       </w:r>
       <w:r>
-        <w:t xml:space="preserve"> 저랭크 잔차 녹아웃. 재학습 없이 \gamma_t=0. RNA 경로 SD 비와 블록 z-RMSE. 원자료 `bio_lowrank_{brca,luad,kirc}/biology.tsv`, `lowrank_recon.csv`.</w:t>
+        <w:t xml:space="preserve"> 저랭크 잔차 녹아웃. 재학습 없이 잔차 경로만 끈다. RNA 경로 SD 비와 블록 z-RMSE. 원자료 `bio_lowrank_{brca,luad,kirc}/biology.tsv`, `lowrank_recon.csv`.</w:t>
       </w:r>
     </w:p>
     <w:tbl>
@@ -8039,7 +8039,7 @@
         <w:t>(B)</w:t>
       </w:r>
       <w:r>
-        <w:t xml:space="preserve"> 같은 가중치에서 \gamma_t만 0으로 둔 녹아웃. 세 암종 모두 경로 표준편차 비가 약 43% 감소한다.</w:t>
+        <w:t xml:space="preserve"> 같은 가중치에서 저랭크 잔차 경로만 끈 녹아웃. \gamma를 0으로 덮어쓰지 않고 경로 스위치를 끈다. 세 암종 모두 경로 표준편차 비가 약 43% 감소한다.</w:t>
       </w:r>
     </w:p>
     <w:p>
@@ -8072,7 +8072,7 @@
         <w:t>(A)</w:t>
       </w:r>
       <w:r>
-        <w:t xml:space="preserve"> 오믹스별 선형 오토인코더가 은닉 h를 만들고, 학습 분할에서 얼린 NMF가 계수 W(k=20)를 닫힌 형으로 낸다. 융합의 주 경로는 존재하는 h의 평균 \barz이다. Transformer는 h와 W를 토큰으로 읽고 영으로 초기화한 \delta를 \barz에 잔차로 더한다. 디코딩은 선형 디코더에 저랭크 잔차 \gamma_t(\hatW_t-\barW_t)H_t를 더한다. 성분이 출력에 들어가는 곳이 이 항이다. \gamma_t=0이면 그림 1B의 녹아웃이 된다.</w:t>
+        <w:t xml:space="preserve"> 오믹스별 선형 오토인코더가 은닉 h를 만들고, 학습 분할에서 얼린 NMF가 계수 W(k=20)를 닫힌 형으로 낸다. 융합의 주 경로는 존재하는 h의 평균 \barz이다. Transformer는 h와 W를 토큰으로 읽고 영으로 초기화한 \delta를 \barz에 잔차로 더한다. 디코딩은 선형 디코더에 저랭크 잔차 \gamma_t(\hatW_t-\barW_t)H_t를 더한다. 성분이 출력에 들어가는 곳이 이 항이다. 저랭크 경로를 끄면 그림 1B의 녹아웃이 된다.</w:t>
       </w:r>
     </w:p>
     <w:p>
@@ -8147,7 +8147,23 @@
         <w:pStyle w:val="ListBullet"/>
       </w:pPr>
       <w:r>
-        <w:t>그림 1은 `paper/figures/plot_pathway_knockout.py`로 그렸다. 숫자는 `source_pathway_knockout.csv`에 고정했다. `.docx`는 이 그림 반영 전이다.</w:t>
+        <w:t>그림 1은 `paper/figures/plot_pathway_knockout.py`로 그렸다. 숫자는 `source_pathway_knockout.csv`에 고정했다.</w:t>
+      </w:r>
+    </w:p>
+    <w:p>
+      <w:pPr>
+        <w:pStyle w:val="ListBullet"/>
+      </w:pPr>
+      <w:r>
+        <w:t>그림 2는 `paper/figures/plot_architecture.py`다.</w:t>
+      </w:r>
+    </w:p>
+    <w:p>
+      <w:pPr>
+        <w:pStyle w:val="ListBullet"/>
+      </w:pPr>
+      <w:r>
+        <w:t>2026-08-23 패치 A/B/C (`mochi_ABC.patch`): γ 전용 학습률·softplus 비음수, NMF 손실 W에 ReLU, 자기정보 베이스라인 4종. `tests/test_patches.py` 17개 통과. 표 1–11과 그림 1은 패치 전 체크포인트 수치이므로, BRCA/LUAD/KIRC 재학습 후 갈아끼워야 한다.</w:t>
       </w:r>
     </w:p>
     <w:sectPr>

</xml_diff>

<commit_message>
fix: freeze v5 NMF loss; generate fig1 from eval tables
정정: train_gate/compare_gate의 NMF 손실을 nonneg=False로 고정한다.
보고 모형의 기본값 변경이 MOCHI-v5 비교군 정의를 조용히 바꾸지 않게 한다.

E/F: biology.tsv에서 source_pathway_knockout.csv를 만드는
make_source_data.py를 넣었다. 없는 값은 만들지 않는다.
그림 1A는 SD 비와 r을 나란히, 1B는 녹아웃 r 덤벨, 1C 주석은
데이터 부호에서 만든다. 옛 CSV로 그리면 재생성 안내와 함께 멈춘다.

eval_biology/eval_ablation 기본 --runs에 녹아웃을 넣었다.
tests/test_patches.py 30개 통과.

Panel B 녹아웃 r은 아직 측정 전이다. 자리표시 값을 CSV에 넣지 않았다.

Co-authored-by: Doyeon <llovable@users.noreply.github.com>
</commit_message>
<xml_diff>
--- a/mochi_code/paper/manuscript_draft_260818.docx
+++ b/mochi_code/paper/manuscript_draft_260818.docx
@@ -680,7 +680,7 @@
     </w:p>
     <w:p>
       <w:r>
-        <w:t>AUROC 대신, 대치된 자료를 실제 분석에 넣었을 때 살아남는 성질을 직접 재었다(표 10, 그림 1A). 블록 결측으로 타깃을 통째로 가린 뒤 채우고, 환자×경로 활성 행렬(hallmark 유전자 집합의 z-점수 평균), 환자 간 상관행렬, ER 양성 대 음성의 Welch t 통계량, RNA-단백질 짝 상관, 메틸화-발현 짝 상관을 참값과 비교한다. 경로 표준편차 비는 참값 대비 경로 활성의 진폭이 얼마나 남았는지를 1을 기준으로 재고, 나머지는 참값과의 일치도다.</w:t>
+        <w:t>AUROC 대신, 대치된 자료를 실제 분석에 넣었을 때 살아남는 성질을 직접 재었다(표 10, 그림 1A). 블록 결측으로 타깃을 통째로 가린 뒤 채우고, 환자×경로 활성 행렬(hallmark 유전자 집합의 z-점수 평균), 환자 간 상관행렬, ER 양성 대 음성의 Welch t 통계량, RNA-단백질 짝 상관, 메틸화-발현 짝 상관을 참값과 비교한다. 경로 표준편차 비는 참값 대비 경로 활성의 진폭이 얼마나 남았는지를 1을 기준으로 재고, 경로 상관 r은 환자별 순서가 맞는지 잰다. 둘 다 1이 진실이라 그림 1A에서 같은 축에 나란히 그린다.</w:t>
       </w:r>
     </w:p>
     <w:p>
@@ -728,7 +728,7 @@
     </w:p>
     <w:p>
       <w:r>
-        <w:t>효과는 크고 세 암종에서 같은 방향이다. RNA 블록의 경로 표준편차 비가 BRCA에서 0.973에서 0.556으로, LUAD에서 0.846에서 0.483으로, KIRC에서 0.796에서 0.445로 떨어진다. 세 코호트 모두 상대적으로 43–44% 감소다(그림 1B). 환자 간 상관 일치도 아홉 개 블록 전부에서 내려가고(예: LUAD 메틸화 0.707→0.629, KIRC 메틸화 0.761→0.664), 메틸화-발현 프로파일 상관도 세 암종 모두 내려간다. 재구성에서도 RNA와 메틸화 z-RMSE가 세 암종에서 일관되게 나빠진다(KIRC RNA 0.864→0.889, 메틸화 0.815→0.858). 경로 활성의 진폭과 환자 간 구조를 저랭크 성분 항이 떠받치고 있다는 뜻이다.</w:t>
+        <w:t>효과는 크고 세 암종에서 같은 방향이다. RNA 블록의 경로 표준편차 비가 BRCA에서 0.973에서 0.556으로, LUAD에서 0.846에서 0.483으로, KIRC에서 0.796에서 0.445로 떨어진다. 세 코호트 모두 상대적으로 43–44% 감소다(그림 1B). 같은 그림에 경로 상관 r의 녹아웃도 그린다. 저랭크를 껐을 때 r이 올라가면, 성분이 진폭을 살리는 대가로 환자 순서를 조금 망친다는 뜻이고, 그건 감출 약점이 아니라 3.10절 트레이드오프의 직접 증거다. r 녹아웃 수치는 `eval_biology.py` 기본 실행에 녹아웃을 넣은 뒤 `make_source_data.py`로 채운다. 환자 간 상관 일치도 아홉 개 블록 전부에서 내려가고(예: LUAD 메틸화 0.707→0.629, KIRC 메틸화 0.761→0.664), 메틸화-발현 프로파일 상관도 세 암종 모두 내려간다. 재구성에서도 RNA와 메틸화 z-RMSE가 세 암종에서 일관되게 나빠진다(KIRC RNA 0.864→0.889, 메틸화 0.815→0.858). 경로 활성의 진폭과 환자 간 구조를 저랭크 성분 항이 떠받치고 있다는 뜻이다.</w:t>
       </w:r>
     </w:p>
     <w:p>
@@ -8017,7 +8017,7 @@
         <w:t>그림 1.</w:t>
       </w:r>
       <w:r>
-        <w:t xml:space="preserve"> 저랭크 NMF 잔차가 Hallmark 경로 활성의 진폭을 보존한다. 파일: `paper/figures/fig1_pathway_knockout.pdf`.</w:t>
+        <w:t xml:space="preserve"> 저랭크 NMF 잔차가 Hallmark 경로 활성의 진폭을 보존한다. 파일: `paper/figures/fig1_pathway_knockout.pdf`. 원자료는 `make_source_data.py`가 `biology.tsv`와 `eval_summary.tsv`에서 만든다.</w:t>
       </w:r>
     </w:p>
     <w:p>
@@ -8028,7 +8028,7 @@
         <w:t>(A)</w:t>
       </w:r>
       <w:r>
-        <w:t xml:space="preserve"> TCGA-BRCA 검사 집합에서 RNA를 통째로 가린 뒤 채웠을 때, 환자 간 경로 활성 표준편차의 참값 대비 비. 막대 옆 r은 경로 점수 상관이다. MOCHI는 진폭(0.973)에서 앞서고, 상관에서는 MIMIR이 앞선다.</w:t>
+        <w:t xml:space="preserve"> TCGA-BRCA 검사 집합, RNA 블록 결측. 색은 방법, 질감은 지표. 실막대는 경로 활성 표준편차 비, 빗금은 경로 점수 상관 r. 둘 다 1이 진실이다. MOCHI는 진폭(0.973)에서 앞서고, 상관(0.663)에서는 MIMIR(0.795)이 앞선다.</w:t>
       </w:r>
     </w:p>
     <w:p>
@@ -8039,7 +8039,7 @@
         <w:t>(B)</w:t>
       </w:r>
       <w:r>
-        <w:t xml:space="preserve"> 같은 가중치에서 저랭크 잔차 경로만 끈 녹아웃. \gamma를 0으로 덮어쓰지 않고 경로 스위치를 끈다. 세 암종 모두 경로 표준편차 비가 약 43% 감소한다.</w:t>
+        <w:t xml:space="preserve"> 같은 가중치에서 저랭크 잔차 경로만 끈 녹아웃. 위 세 행은 진폭, 아래 세 행은 r. 진폭은 세 암종 모두 약 43% 감소한다. r이 녹아웃에서 올라가면 성분이 진폭–순서 트레이드오프의 원인이다.</w:t>
       </w:r>
     </w:p>
     <w:p>
@@ -8050,7 +8050,7 @@
         <w:t>(C)</w:t>
       </w:r>
       <w:r>
-        <w:t xml:space="preserve"> 녹아웃 전후 블록 z-RMSE 차이(녹아웃 − 보고 모형). 양수는 저랭크가 오차를 줄였다는 뜻이다. RNA·메틸화는 양수, 단백질은 음수다.</w:t>
+        <w:t xml:space="preserve"> 녹아웃 − 보고 모형의 블록 z-RMSE. 양수는 저랭크가 오차를 줄였다는 뜻이다. 주석 문구는 데이터 부호에서 만든다.</w:t>
       </w:r>
     </w:p>
     <w:p>
@@ -8147,7 +8147,7 @@
         <w:pStyle w:val="ListBullet"/>
       </w:pPr>
       <w:r>
-        <w:t>그림 1은 `paper/figures/plot_pathway_knockout.py`로 그렸다. 숫자는 `source_pathway_knockout.csv`에 고정했다.</w:t>
+        <w:t>그림 1은 `paper/figures/plot_pathway_knockout.py`로 그린다. 원자료는 `make_source_data.py`가 만든다. 커밋된 `source_pathway_knockout.csv`에는 Panel B의 녹아웃 r이 아직 없다. 옛 CSV로 그림을 돌리면 재생성 안내와 함께 멈춘다. 자리표시 값을 넣지 않는다.</w:t>
       </w:r>
     </w:p>
     <w:p>

</xml_diff>